<commit_message>
minimise chat button fixed
</commit_message>
<xml_diff>
--- a/B894-25K/FBL-PhD-research-proposal.docx
+++ b/B894-25K/FBL-PhD-research-proposal.docx
@@ -3078,7 +3078,40 @@
           <w:sz w:val="20"/>
           <w:szCs w:val="20"/>
         </w:rPr>
-        <w:t xml:space="preserve"> Sir Charlie Mayfield Review </w:t>
+        <w:t xml:space="preserve"> </w:t>
+      </w:r>
+      <w:r>
+        <w:rPr>
+          <w:rFonts w:ascii="CMU Sans Serif" w:hAnsi="CMU Sans Serif" w:cs="CMU Sans Serif"/>
+          <w:b/>
+          <w:bCs/>
+          <w:sz w:val="20"/>
+          <w:szCs w:val="20"/>
+          <w:rPrChange w:id="110" w:author="Alfred Anate Bodurin Mayaki" w:date="2026-01-27T10:03:00Z" w16du:dateUtc="2026-01-27T10:03:00Z">
+            <w:rPr>
+              <w:rFonts w:ascii="CMU Sans Serif" w:hAnsi="CMU Sans Serif" w:cs="CMU Sans Serif"/>
+              <w:sz w:val="20"/>
+              <w:szCs w:val="20"/>
+            </w:rPr>
+          </w:rPrChange>
+        </w:rPr>
+        <w:t xml:space="preserve">Sir Charlie Mayfield </w:t>
+      </w:r>
+      <w:r>
+        <w:rPr>
+          <w:rFonts w:ascii="CMU Sans Serif" w:hAnsi="CMU Sans Serif" w:cs="CMU Sans Serif"/>
+          <w:sz w:val="20"/>
+          <w:szCs w:val="20"/>
+        </w:rPr>
+        <w:t>Review</w:t>
+      </w:r>
+      <w:r>
+        <w:rPr>
+          <w:rFonts w:ascii="CMU Sans Serif" w:hAnsi="CMU Sans Serif" w:cs="CMU Sans Serif"/>
+          <w:sz w:val="20"/>
+          <w:szCs w:val="20"/>
+        </w:rPr>
+        <w:t xml:space="preserve"> </w:t>
       </w:r>
       <w:r>
         <w:rPr>
@@ -3128,7 +3161,7 @@
         </w:rPr>
         <w:t>Th</w:t>
       </w:r>
-      <w:ins w:id="110" w:author="Alfred Anate Bodurin Mayaki" w:date="2026-01-12T17:16:00Z" w16du:dateUtc="2026-01-12T17:16:00Z">
+      <w:ins w:id="111" w:author="Alfred Anate Bodurin Mayaki" w:date="2026-01-12T17:16:00Z" w16du:dateUtc="2026-01-12T17:16:00Z">
         <w:r>
           <w:rPr>
             <w:rFonts w:ascii="CMU Sans Serif" w:hAnsi="CMU Sans Serif" w:cs="CMU Sans Serif"/>
@@ -3138,7 +3171,7 @@
           <w:t xml:space="preserve">e aforementioned </w:t>
         </w:r>
       </w:ins>
-      <w:del w:id="111" w:author="Alfred Anate Bodurin Mayaki" w:date="2026-01-12T17:16:00Z" w16du:dateUtc="2026-01-12T17:16:00Z">
+      <w:del w:id="112" w:author="Alfred Anate Bodurin Mayaki" w:date="2026-01-12T17:16:00Z" w16du:dateUtc="2026-01-12T17:16:00Z">
         <w:r>
           <w:rPr>
             <w:rFonts w:ascii="CMU Sans Serif" w:hAnsi="CMU Sans Serif" w:cs="CMU Sans Serif"/>
@@ -3251,7 +3284,7 @@
           <w:color w:val="auto"/>
         </w:rPr>
       </w:pPr>
-      <w:bookmarkStart w:id="112" w:name="_Toc219130659"/>
+      <w:bookmarkStart w:id="113" w:name="_Toc219130659"/>
       <w:r>
         <w:rPr>
           <w:rStyle w:val="Strong"/>
@@ -3272,7 +3305,7 @@
         </w:rPr>
         <w:t>Introduction</w:t>
       </w:r>
-      <w:bookmarkEnd w:id="112"/>
+      <w:bookmarkEnd w:id="113"/>
     </w:p>
     <w:p>
       <w:pPr>
@@ -3309,8 +3342,8 @@
         </w:rPr>
         <w:t xml:space="preserve"> teams can be 30% more productive than those which do not include neurodiverse employees (NatWest Mentor, 2025), and with Gen Z entering the workforce – over 50% of whom have some sort of neurodivergent condition</w:t>
       </w:r>
-      <w:commentRangeStart w:id="113"/>
       <w:commentRangeStart w:id="114"/>
+      <w:commentRangeStart w:id="115"/>
       <w:r>
         <w:rPr>
           <w:rStyle w:val="FootnoteReference"/>
@@ -3320,20 +3353,20 @@
         </w:rPr>
         <w:footnoteReference w:id="2"/>
       </w:r>
-      <w:commentRangeEnd w:id="113"/>
+      <w:commentRangeEnd w:id="114"/>
       <w:r>
         <w:rPr>
           <w:rStyle w:val="CommentReference"/>
           <w:rFonts w:ascii="CMU Sans Serif" w:hAnsi="CMU Sans Serif" w:cs="CMU Sans Serif"/>
         </w:rPr>
-        <w:commentReference w:id="113"/>
-      </w:r>
-      <w:commentRangeEnd w:id="114"/>
+        <w:commentReference w:id="114"/>
+      </w:r>
+      <w:commentRangeEnd w:id="115"/>
       <w:r>
         <w:rPr>
           <w:rStyle w:val="CommentReference"/>
         </w:rPr>
-        <w:commentReference w:id="114"/>
+        <w:commentReference w:id="115"/>
       </w:r>
       <w:r>
         <w:rPr>
@@ -3409,7 +3442,7 @@
         </w:rPr>
         <w:t xml:space="preserve"> (</w:t>
       </w:r>
-      <w:commentRangeStart w:id="115"/>
+      <w:commentRangeStart w:id="116"/>
       <w:r>
         <w:rPr>
           <w:rFonts w:ascii="CMU Sans Serif" w:hAnsi="CMU Sans Serif" w:cs="CMU Sans Serif"/>
@@ -3418,13 +3451,13 @@
         </w:rPr>
         <w:t>psychology</w:t>
       </w:r>
-      <w:commentRangeEnd w:id="115"/>
+      <w:commentRangeEnd w:id="116"/>
       <w:r>
         <w:rPr>
           <w:rStyle w:val="CommentReference"/>
           <w:rFonts w:ascii="CMU Sans Serif" w:hAnsi="CMU Sans Serif" w:cs="CMU Sans Serif"/>
         </w:rPr>
-        <w:commentReference w:id="115"/>
+        <w:commentReference w:id="116"/>
       </w:r>
       <w:r>
         <w:rPr>
@@ -3606,7 +3639,7 @@
           <w:color w:val="auto"/>
         </w:rPr>
       </w:pPr>
-      <w:bookmarkStart w:id="116" w:name="_Toc219130660"/>
+      <w:bookmarkStart w:id="117" w:name="_Toc219130660"/>
       <w:r>
         <w:rPr>
           <w:rStyle w:val="Strong"/>
@@ -3627,7 +3660,7 @@
         </w:rPr>
         <w:t>Methodology</w:t>
       </w:r>
-      <w:bookmarkEnd w:id="116"/>
+      <w:bookmarkEnd w:id="117"/>
     </w:p>
     <w:p>
       <w:pPr>
@@ -3970,9 +4003,9 @@
         </w:rPr>
         <w:t xml:space="preserve"> Firms having lower net spend signal less resource-based HRM </w:t>
       </w:r>
-      <w:commentRangeStart w:id="117"/>
       <w:commentRangeStart w:id="118"/>
       <w:commentRangeStart w:id="119"/>
+      <w:commentRangeStart w:id="120"/>
       <w:r>
         <w:rPr>
           <w:rFonts w:ascii="CMU Sans Serif" w:hAnsi="CMU Sans Serif" w:cs="CMU Sans Serif"/>
@@ -3981,29 +4014,29 @@
         </w:rPr>
         <w:t>practices</w:t>
       </w:r>
-      <w:commentRangeEnd w:id="117"/>
+      <w:commentRangeEnd w:id="118"/>
       <w:r>
         <w:rPr>
           <w:rStyle w:val="CommentReference"/>
           <w:rFonts w:ascii="CMU Sans Serif" w:hAnsi="CMU Sans Serif" w:cs="CMU Sans Serif"/>
         </w:rPr>
-        <w:commentReference w:id="117"/>
-      </w:r>
-      <w:commentRangeEnd w:id="118"/>
+        <w:commentReference w:id="118"/>
+      </w:r>
+      <w:commentRangeEnd w:id="119"/>
       <w:r>
         <w:rPr>
           <w:rStyle w:val="CommentReference"/>
           <w:rFonts w:ascii="CMU Sans Serif" w:hAnsi="CMU Sans Serif" w:cs="CMU Sans Serif"/>
         </w:rPr>
-        <w:commentReference w:id="118"/>
-      </w:r>
-      <w:commentRangeEnd w:id="119"/>
+        <w:commentReference w:id="119"/>
+      </w:r>
+      <w:commentRangeEnd w:id="120"/>
       <w:r>
         <w:rPr>
           <w:rStyle w:val="CommentReference"/>
           <w:rFonts w:ascii="CMU Sans Serif" w:hAnsi="CMU Sans Serif" w:cs="CMU Sans Serif"/>
         </w:rPr>
-        <w:commentReference w:id="119"/>
+        <w:commentReference w:id="120"/>
       </w:r>
     </w:p>
     <w:p>
@@ -4179,8 +4212,8 @@
           <w:color w:val="auto"/>
         </w:rPr>
       </w:pPr>
-      <w:bookmarkStart w:id="120" w:name="_Toc215736436"/>
-      <w:bookmarkStart w:id="121" w:name="_Toc219130661"/>
+      <w:bookmarkStart w:id="121" w:name="_Toc215736436"/>
+      <w:bookmarkStart w:id="122" w:name="_Toc219130661"/>
       <w:r>
         <w:rPr>
           <w:rStyle w:val="Strong"/>
@@ -4201,8 +4234,8 @@
         </w:rPr>
         <w:t>Why this topic is important</w:t>
       </w:r>
-      <w:bookmarkEnd w:id="120"/>
       <w:bookmarkEnd w:id="121"/>
+      <w:bookmarkEnd w:id="122"/>
     </w:p>
     <w:p>
       <w:pPr>
@@ -4223,7 +4256,7 @@
         </w:rPr>
         <w:t xml:space="preserve">The importance of this research topic cannot be </w:t>
       </w:r>
-      <w:commentRangeStart w:id="122"/>
+      <w:commentRangeStart w:id="123"/>
       <w:r>
         <w:rPr>
           <w:rFonts w:ascii="CMU Sans Serif" w:hAnsi="CMU Sans Serif" w:cs="CMU Sans Serif"/>
@@ -4232,13 +4265,13 @@
         </w:rPr>
         <w:t>understated</w:t>
       </w:r>
-      <w:commentRangeEnd w:id="122"/>
+      <w:commentRangeEnd w:id="123"/>
       <w:r>
         <w:rPr>
           <w:rStyle w:val="CommentReference"/>
           <w:rFonts w:ascii="CMU Sans Serif" w:hAnsi="CMU Sans Serif" w:cs="CMU Sans Serif"/>
         </w:rPr>
-        <w:commentReference w:id="122"/>
+        <w:commentReference w:id="123"/>
       </w:r>
       <w:r>
         <w:rPr>
@@ -4682,9 +4715,9 @@
         </w:rPr>
         <w:t xml:space="preserve">Data on how firms spend on recruitment </w:t>
       </w:r>
-      <w:commentRangeStart w:id="123"/>
       <w:commentRangeStart w:id="124"/>
       <w:commentRangeStart w:id="125"/>
+      <w:commentRangeStart w:id="126"/>
       <w:r>
         <w:rPr>
           <w:rStyle w:val="Strong"/>
@@ -4696,29 +4729,29 @@
         </w:rPr>
         <w:t>websites</w:t>
       </w:r>
-      <w:commentRangeEnd w:id="123"/>
+      <w:commentRangeEnd w:id="124"/>
       <w:r>
         <w:rPr>
           <w:rStyle w:val="CommentReference"/>
           <w:rFonts w:ascii="CMU Sans Serif" w:hAnsi="CMU Sans Serif" w:cs="CMU Sans Serif"/>
         </w:rPr>
-        <w:commentReference w:id="123"/>
-      </w:r>
-      <w:commentRangeEnd w:id="124"/>
+        <w:commentReference w:id="124"/>
+      </w:r>
+      <w:commentRangeEnd w:id="125"/>
       <w:r>
         <w:rPr>
           <w:rStyle w:val="CommentReference"/>
           <w:rFonts w:ascii="CMU Sans Serif" w:hAnsi="CMU Sans Serif" w:cs="CMU Sans Serif"/>
         </w:rPr>
-        <w:commentReference w:id="124"/>
-      </w:r>
-      <w:commentRangeEnd w:id="125"/>
+        <w:commentReference w:id="125"/>
+      </w:r>
+      <w:commentRangeEnd w:id="126"/>
       <w:r>
         <w:rPr>
           <w:rStyle w:val="CommentReference"/>
           <w:rFonts w:ascii="CMU Sans Serif" w:hAnsi="CMU Sans Serif" w:cs="CMU Sans Serif"/>
         </w:rPr>
-        <w:commentReference w:id="125"/>
+        <w:commentReference w:id="126"/>
       </w:r>
     </w:p>
     <w:p>
@@ -4734,8 +4767,8 @@
           <w:color w:val="auto"/>
         </w:rPr>
       </w:pPr>
-      <w:bookmarkStart w:id="126" w:name="_Toc215736437"/>
-      <w:bookmarkStart w:id="127" w:name="_Toc219130662"/>
+      <w:bookmarkStart w:id="127" w:name="_Toc215736437"/>
+      <w:bookmarkStart w:id="128" w:name="_Toc219130662"/>
       <w:r>
         <w:rPr>
           <w:rFonts w:ascii="CMU Sans Serif" w:hAnsi="CMU Sans Serif" w:cs="CMU Sans Serif"/>
@@ -4757,8 +4790,8 @@
         </w:rPr>
         <w:t>Next Steps</w:t>
       </w:r>
-      <w:bookmarkEnd w:id="126"/>
       <w:bookmarkEnd w:id="127"/>
+      <w:bookmarkEnd w:id="128"/>
     </w:p>
     <w:p>
       <w:pPr>
@@ -4996,8 +5029,8 @@
         </w:rPr>
         <w:t xml:space="preserve"> and indeed qualitative analysis </w:t>
       </w:r>
-      <w:commentRangeStart w:id="128"/>
       <w:commentRangeStart w:id="129"/>
+      <w:commentRangeStart w:id="130"/>
       <w:r>
         <w:rPr>
           <w:rStyle w:val="Strong"/>
@@ -5009,21 +5042,21 @@
         </w:rPr>
         <w:t>such</w:t>
       </w:r>
-      <w:commentRangeEnd w:id="128"/>
+      <w:commentRangeEnd w:id="129"/>
       <w:r>
         <w:rPr>
           <w:rStyle w:val="CommentReference"/>
           <w:rFonts w:ascii="CMU Sans Serif" w:hAnsi="CMU Sans Serif" w:cs="CMU Sans Serif"/>
         </w:rPr>
-        <w:commentReference w:id="128"/>
-      </w:r>
-      <w:commentRangeEnd w:id="129"/>
+        <w:commentReference w:id="129"/>
+      </w:r>
+      <w:commentRangeEnd w:id="130"/>
       <w:r>
         <w:rPr>
           <w:rStyle w:val="CommentReference"/>
           <w:rFonts w:ascii="CMU Sans Serif" w:hAnsi="CMU Sans Serif" w:cs="CMU Sans Serif"/>
         </w:rPr>
-        <w:commentReference w:id="129"/>
+        <w:commentReference w:id="130"/>
       </w:r>
       <w:r>
         <w:rPr>
@@ -5689,9 +5722,9 @@
           <w:color w:val="000000" w:themeColor="text1"/>
         </w:rPr>
       </w:pPr>
-      <w:bookmarkStart w:id="130" w:name="_Toc216632807"/>
-      <w:bookmarkStart w:id="131" w:name="_Toc219130663"/>
-      <w:bookmarkStart w:id="132" w:name="_Toc215736438"/>
+      <w:bookmarkStart w:id="131" w:name="_Toc216632807"/>
+      <w:bookmarkStart w:id="132" w:name="_Toc219130663"/>
+      <w:bookmarkStart w:id="133" w:name="_Toc215736438"/>
       <w:r>
         <w:rPr>
           <w:rStyle w:val="Strong"/>
@@ -5712,7 +5745,7 @@
         </w:rPr>
         <w:t>Introduction to TMA 2</w:t>
       </w:r>
-      <w:bookmarkEnd w:id="130"/>
+      <w:bookmarkEnd w:id="131"/>
       <w:r>
         <w:rPr>
           <w:rStyle w:val="Strong"/>
@@ -5723,7 +5756,7 @@
         </w:rPr>
         <w:t xml:space="preserve"> – Literature Review</w:t>
       </w:r>
-      <w:bookmarkEnd w:id="131"/>
+      <w:bookmarkEnd w:id="132"/>
     </w:p>
     <w:p>
       <w:pPr>
@@ -5858,8 +5891,8 @@
           <w:color w:val="000000" w:themeColor="text1"/>
         </w:rPr>
       </w:pPr>
-      <w:bookmarkStart w:id="133" w:name="_Toc216632808"/>
-      <w:bookmarkStart w:id="134" w:name="_Toc219130664"/>
+      <w:bookmarkStart w:id="134" w:name="_Toc216632808"/>
+      <w:bookmarkStart w:id="135" w:name="_Toc219130664"/>
       <w:r>
         <w:rPr>
           <w:rStyle w:val="Strong"/>
@@ -5880,8 +5913,8 @@
         </w:rPr>
         <w:t>Mapping subtopics that are relevant</w:t>
       </w:r>
-      <w:bookmarkEnd w:id="133"/>
       <w:bookmarkEnd w:id="134"/>
+      <w:bookmarkEnd w:id="135"/>
     </w:p>
     <w:p>
       <w:pPr>
@@ -6188,7 +6221,7 @@
         </w:rPr>
         <w:t>Mind Map of Relevant Literature Subtopics</w:t>
       </w:r>
-      <w:ins w:id="135" w:author="Alfred Anate Bodurin Mayaki" w:date="2026-01-12T16:58:00Z" w16du:dateUtc="2026-01-12T16:58:00Z">
+      <w:ins w:id="136" w:author="Alfred Anate Bodurin Mayaki" w:date="2026-01-12T16:58:00Z" w16du:dateUtc="2026-01-12T16:58:00Z">
         <w:r>
           <w:rPr>
             <w:rFonts w:ascii="CMU Sans Serif" w:hAnsi="CMU Sans Serif" w:cs="CMU Sans Serif"/>
@@ -6215,7 +6248,7 @@
           <w:color w:val="000000" w:themeColor="text1"/>
         </w:rPr>
         <w:drawing>
-          <wp:inline distT="0" distB="0" distL="0" distR="0" wp14:anchorId="24BB0966" wp14:editId="2AFD0A0F">
+          <wp:inline distT="0" distB="0" distL="0" distR="0" wp14:anchorId="24BB0966" wp14:editId="3B124850">
             <wp:extent cx="4823276" cy="2865640"/>
             <wp:effectExtent l="0" t="0" r="0" b="0"/>
             <wp:docPr id="422260730" name="Picture 2" descr="A diagram of a business process"/>
@@ -6270,8 +6303,8 @@
           <w:color w:val="000000" w:themeColor="text1"/>
         </w:rPr>
       </w:pPr>
-      <w:bookmarkStart w:id="136" w:name="_Toc216632809"/>
-      <w:bookmarkStart w:id="137" w:name="_Toc219130665"/>
+      <w:bookmarkStart w:id="137" w:name="_Toc216632809"/>
+      <w:bookmarkStart w:id="138" w:name="_Toc219130665"/>
       <w:r>
         <w:rPr>
           <w:rStyle w:val="Strong"/>
@@ -6293,8 +6326,8 @@
         </w:rPr>
         <w:t>Explicating my Literature Review 1</w:t>
       </w:r>
-      <w:bookmarkEnd w:id="136"/>
       <w:bookmarkEnd w:id="137"/>
+      <w:bookmarkEnd w:id="138"/>
     </w:p>
     <w:p>
       <w:pPr>
@@ -6765,13 +6798,13 @@
         </w:numPr>
         <w:jc w:val="both"/>
         <w:rPr>
-          <w:del w:id="138" w:author="Alfred Anate Bodurin Mayaki" w:date="2026-01-12T17:01:00Z" w16du:dateUtc="2026-01-12T17:01:00Z"/>
+          <w:del w:id="139" w:author="Alfred Anate Bodurin Mayaki" w:date="2026-01-12T17:01:00Z" w16du:dateUtc="2026-01-12T17:01:00Z"/>
           <w:rFonts w:ascii="CMU Sans Serif" w:hAnsi="CMU Sans Serif" w:cs="CMU Sans Serif"/>
           <w:color w:val="000000" w:themeColor="text1"/>
           <w:u w:val="single"/>
         </w:rPr>
       </w:pPr>
-      <w:del w:id="139" w:author="Alfred Anate Bodurin Mayaki" w:date="2026-01-12T17:01:00Z" w16du:dateUtc="2026-01-12T17:01:00Z">
+      <w:del w:id="140" w:author="Alfred Anate Bodurin Mayaki" w:date="2026-01-12T17:01:00Z" w16du:dateUtc="2026-01-12T17:01:00Z">
         <w:r>
           <w:rPr>
             <w:rFonts w:ascii="CMU Sans Serif" w:hAnsi="CMU Sans Serif" w:cs="CMU Sans Serif"/>
@@ -6796,7 +6829,7 @@
       <w:tr>
         <w:trPr>
           <w:cnfStyle w:val="100000000000" w:firstRow="1" w:lastRow="0" w:firstColumn="0" w:lastColumn="0" w:oddVBand="0" w:evenVBand="0" w:oddHBand="0" w:evenHBand="0" w:firstRowFirstColumn="0" w:firstRowLastColumn="0" w:lastRowFirstColumn="0" w:lastRowLastColumn="0"/>
-          <w:del w:id="140" w:author="Alfred Anate Bodurin Mayaki" w:date="2026-01-12T17:01:00Z"/>
+          <w:del w:id="141" w:author="Alfred Anate Bodurin Mayaki" w:date="2026-01-12T17:01:00Z"/>
         </w:trPr>
         <w:tc>
           <w:tcPr>
@@ -6807,7 +6840,7 @@
             <w:pPr>
               <w:jc w:val="both"/>
               <w:rPr>
-                <w:del w:id="141" w:author="Alfred Anate Bodurin Mayaki" w:date="2026-01-12T17:01:00Z" w16du:dateUtc="2026-01-12T17:01:00Z"/>
+                <w:del w:id="142" w:author="Alfred Anate Bodurin Mayaki" w:date="2026-01-12T17:01:00Z" w16du:dateUtc="2026-01-12T17:01:00Z"/>
                 <w:rFonts w:ascii="CMU Sans Serif" w:hAnsi="CMU Sans Serif" w:cs="CMU Sans Serif"/>
                 <w:b w:val="0"/>
                 <w:bCs w:val="0"/>
@@ -6816,7 +6849,7 @@
                 <w:szCs w:val="20"/>
               </w:rPr>
             </w:pPr>
-            <w:del w:id="142" w:author="Alfred Anate Bodurin Mayaki" w:date="2026-01-12T17:01:00Z" w16du:dateUtc="2026-01-12T17:01:00Z">
+            <w:del w:id="143" w:author="Alfred Anate Bodurin Mayaki" w:date="2026-01-12T17:01:00Z" w16du:dateUtc="2026-01-12T17:01:00Z">
               <w:r>
                 <w:rPr>
                   <w:rFonts w:ascii="CMU Sans Serif" w:hAnsi="CMU Sans Serif" w:cs="CMU Sans Serif"/>
@@ -6838,7 +6871,7 @@
               <w:jc w:val="both"/>
               <w:cnfStyle w:val="100000000000" w:firstRow="1" w:lastRow="0" w:firstColumn="0" w:lastColumn="0" w:oddVBand="0" w:evenVBand="0" w:oddHBand="0" w:evenHBand="0" w:firstRowFirstColumn="0" w:firstRowLastColumn="0" w:lastRowFirstColumn="0" w:lastRowLastColumn="0"/>
               <w:rPr>
-                <w:del w:id="143" w:author="Alfred Anate Bodurin Mayaki" w:date="2026-01-12T17:01:00Z" w16du:dateUtc="2026-01-12T17:01:00Z"/>
+                <w:del w:id="144" w:author="Alfred Anate Bodurin Mayaki" w:date="2026-01-12T17:01:00Z" w16du:dateUtc="2026-01-12T17:01:00Z"/>
                 <w:rFonts w:ascii="CMU Sans Serif" w:hAnsi="CMU Sans Serif" w:cs="CMU Sans Serif"/>
                 <w:b w:val="0"/>
                 <w:bCs w:val="0"/>
@@ -6847,7 +6880,7 @@
                 <w:szCs w:val="20"/>
               </w:rPr>
             </w:pPr>
-            <w:del w:id="144" w:author="Alfred Anate Bodurin Mayaki" w:date="2026-01-12T17:01:00Z" w16du:dateUtc="2026-01-12T17:01:00Z">
+            <w:del w:id="145" w:author="Alfred Anate Bodurin Mayaki" w:date="2026-01-12T17:01:00Z" w16du:dateUtc="2026-01-12T17:01:00Z">
               <w:r>
                 <w:rPr>
                   <w:rFonts w:ascii="CMU Sans Serif" w:hAnsi="CMU Sans Serif" w:cs="CMU Sans Serif"/>
@@ -6869,7 +6902,7 @@
               <w:jc w:val="both"/>
               <w:cnfStyle w:val="100000000000" w:firstRow="1" w:lastRow="0" w:firstColumn="0" w:lastColumn="0" w:oddVBand="0" w:evenVBand="0" w:oddHBand="0" w:evenHBand="0" w:firstRowFirstColumn="0" w:firstRowLastColumn="0" w:lastRowFirstColumn="0" w:lastRowLastColumn="0"/>
               <w:rPr>
-                <w:del w:id="145" w:author="Alfred Anate Bodurin Mayaki" w:date="2026-01-12T17:01:00Z" w16du:dateUtc="2026-01-12T17:01:00Z"/>
+                <w:del w:id="146" w:author="Alfred Anate Bodurin Mayaki" w:date="2026-01-12T17:01:00Z" w16du:dateUtc="2026-01-12T17:01:00Z"/>
                 <w:rFonts w:ascii="CMU Sans Serif" w:hAnsi="CMU Sans Serif" w:cs="CMU Sans Serif"/>
                 <w:b w:val="0"/>
                 <w:bCs w:val="0"/>
@@ -6878,7 +6911,7 @@
                 <w:szCs w:val="20"/>
               </w:rPr>
             </w:pPr>
-            <w:del w:id="146" w:author="Alfred Anate Bodurin Mayaki" w:date="2026-01-12T17:01:00Z" w16du:dateUtc="2026-01-12T17:01:00Z">
+            <w:del w:id="147" w:author="Alfred Anate Bodurin Mayaki" w:date="2026-01-12T17:01:00Z" w16du:dateUtc="2026-01-12T17:01:00Z">
               <w:r>
                 <w:rPr>
                   <w:rFonts w:ascii="CMU Sans Serif" w:hAnsi="CMU Sans Serif" w:cs="CMU Sans Serif"/>
@@ -6895,7 +6928,7 @@
       <w:tr>
         <w:trPr>
           <w:cnfStyle w:val="000000100000" w:firstRow="0" w:lastRow="0" w:firstColumn="0" w:lastColumn="0" w:oddVBand="0" w:evenVBand="0" w:oddHBand="1" w:evenHBand="0" w:firstRowFirstColumn="0" w:firstRowLastColumn="0" w:lastRowFirstColumn="0" w:lastRowLastColumn="0"/>
-          <w:del w:id="147" w:author="Alfred Anate Bodurin Mayaki" w:date="2026-01-12T17:01:00Z"/>
+          <w:del w:id="148" w:author="Alfred Anate Bodurin Mayaki" w:date="2026-01-12T17:01:00Z"/>
         </w:trPr>
         <w:tc>
           <w:tcPr>
@@ -6906,14 +6939,14 @@
             <w:pPr>
               <w:jc w:val="both"/>
               <w:rPr>
-                <w:del w:id="148" w:author="Alfred Anate Bodurin Mayaki" w:date="2026-01-12T17:01:00Z" w16du:dateUtc="2026-01-12T17:01:00Z"/>
+                <w:del w:id="149" w:author="Alfred Anate Bodurin Mayaki" w:date="2026-01-12T17:01:00Z" w16du:dateUtc="2026-01-12T17:01:00Z"/>
                 <w:rFonts w:ascii="CMU Sans Serif" w:hAnsi="CMU Sans Serif" w:cs="CMU Sans Serif"/>
                 <w:color w:val="000000" w:themeColor="text1"/>
                 <w:sz w:val="20"/>
                 <w:szCs w:val="20"/>
               </w:rPr>
             </w:pPr>
-            <w:del w:id="149" w:author="Alfred Anate Bodurin Mayaki" w:date="2026-01-12T17:01:00Z" w16du:dateUtc="2026-01-12T17:01:00Z">
+            <w:del w:id="150" w:author="Alfred Anate Bodurin Mayaki" w:date="2026-01-12T17:01:00Z" w16du:dateUtc="2026-01-12T17:01:00Z">
               <w:r>
                 <w:rPr>
                   <w:rFonts w:ascii="CMU Sans Serif" w:hAnsi="CMU Sans Serif" w:cs="CMU Sans Serif"/>
@@ -6935,14 +6968,14 @@
               <w:jc w:val="both"/>
               <w:cnfStyle w:val="000000100000" w:firstRow="0" w:lastRow="0" w:firstColumn="0" w:lastColumn="0" w:oddVBand="0" w:evenVBand="0" w:oddHBand="1" w:evenHBand="0" w:firstRowFirstColumn="0" w:firstRowLastColumn="0" w:lastRowFirstColumn="0" w:lastRowLastColumn="0"/>
               <w:rPr>
-                <w:del w:id="150" w:author="Alfred Anate Bodurin Mayaki" w:date="2026-01-12T17:01:00Z" w16du:dateUtc="2026-01-12T17:01:00Z"/>
+                <w:del w:id="151" w:author="Alfred Anate Bodurin Mayaki" w:date="2026-01-12T17:01:00Z" w16du:dateUtc="2026-01-12T17:01:00Z"/>
                 <w:rFonts w:ascii="CMU Sans Serif" w:hAnsi="CMU Sans Serif" w:cs="CMU Sans Serif"/>
                 <w:color w:val="000000" w:themeColor="text1"/>
                 <w:sz w:val="20"/>
                 <w:szCs w:val="20"/>
               </w:rPr>
             </w:pPr>
-            <w:del w:id="151" w:author="Alfred Anate Bodurin Mayaki" w:date="2026-01-12T17:01:00Z" w16du:dateUtc="2026-01-12T17:01:00Z">
+            <w:del w:id="152" w:author="Alfred Anate Bodurin Mayaki" w:date="2026-01-12T17:01:00Z" w16du:dateUtc="2026-01-12T17:01:00Z">
               <w:r>
                 <w:rPr>
                   <w:rFonts w:ascii="CMU Sans Serif" w:hAnsi="CMU Sans Serif" w:cs="CMU Sans Serif"/>
@@ -6964,14 +6997,14 @@
               <w:jc w:val="both"/>
               <w:cnfStyle w:val="000000100000" w:firstRow="0" w:lastRow="0" w:firstColumn="0" w:lastColumn="0" w:oddVBand="0" w:evenVBand="0" w:oddHBand="1" w:evenHBand="0" w:firstRowFirstColumn="0" w:firstRowLastColumn="0" w:lastRowFirstColumn="0" w:lastRowLastColumn="0"/>
               <w:rPr>
-                <w:del w:id="152" w:author="Alfred Anate Bodurin Mayaki" w:date="2026-01-12T17:01:00Z" w16du:dateUtc="2026-01-12T17:01:00Z"/>
+                <w:del w:id="153" w:author="Alfred Anate Bodurin Mayaki" w:date="2026-01-12T17:01:00Z" w16du:dateUtc="2026-01-12T17:01:00Z"/>
                 <w:rFonts w:ascii="CMU Sans Serif" w:hAnsi="CMU Sans Serif" w:cs="CMU Sans Serif"/>
                 <w:color w:val="000000" w:themeColor="text1"/>
                 <w:sz w:val="20"/>
                 <w:szCs w:val="20"/>
               </w:rPr>
             </w:pPr>
-            <w:del w:id="153" w:author="Alfred Anate Bodurin Mayaki" w:date="2026-01-12T17:01:00Z" w16du:dateUtc="2026-01-12T17:01:00Z">
+            <w:del w:id="154" w:author="Alfred Anate Bodurin Mayaki" w:date="2026-01-12T17:01:00Z" w16du:dateUtc="2026-01-12T17:01:00Z">
               <w:r>
                 <w:rPr>
                   <w:rFonts w:ascii="CMU Sans Serif" w:hAnsi="CMU Sans Serif" w:cs="CMU Sans Serif"/>
@@ -6987,7 +7020,7 @@
       </w:tr>
       <w:tr>
         <w:trPr>
-          <w:del w:id="154" w:author="Alfred Anate Bodurin Mayaki" w:date="2026-01-12T17:01:00Z"/>
+          <w:del w:id="155" w:author="Alfred Anate Bodurin Mayaki" w:date="2026-01-12T17:01:00Z"/>
         </w:trPr>
         <w:tc>
           <w:tcPr>
@@ -6998,14 +7031,14 @@
             <w:pPr>
               <w:jc w:val="both"/>
               <w:rPr>
-                <w:del w:id="155" w:author="Alfred Anate Bodurin Mayaki" w:date="2026-01-12T17:01:00Z" w16du:dateUtc="2026-01-12T17:01:00Z"/>
+                <w:del w:id="156" w:author="Alfred Anate Bodurin Mayaki" w:date="2026-01-12T17:01:00Z" w16du:dateUtc="2026-01-12T17:01:00Z"/>
                 <w:rFonts w:ascii="CMU Sans Serif" w:hAnsi="CMU Sans Serif" w:cs="CMU Sans Serif"/>
                 <w:color w:val="000000" w:themeColor="text1"/>
                 <w:sz w:val="20"/>
                 <w:szCs w:val="20"/>
               </w:rPr>
             </w:pPr>
-            <w:del w:id="156" w:author="Alfred Anate Bodurin Mayaki" w:date="2026-01-12T17:01:00Z" w16du:dateUtc="2026-01-12T17:01:00Z">
+            <w:del w:id="157" w:author="Alfred Anate Bodurin Mayaki" w:date="2026-01-12T17:01:00Z" w16du:dateUtc="2026-01-12T17:01:00Z">
               <w:r>
                 <w:rPr>
                   <w:rFonts w:ascii="CMU Sans Serif" w:hAnsi="CMU Sans Serif" w:cs="CMU Sans Serif"/>
@@ -7027,14 +7060,14 @@
               <w:jc w:val="both"/>
               <w:cnfStyle w:val="000000000000" w:firstRow="0" w:lastRow="0" w:firstColumn="0" w:lastColumn="0" w:oddVBand="0" w:evenVBand="0" w:oddHBand="0" w:evenHBand="0" w:firstRowFirstColumn="0" w:firstRowLastColumn="0" w:lastRowFirstColumn="0" w:lastRowLastColumn="0"/>
               <w:rPr>
-                <w:del w:id="157" w:author="Alfred Anate Bodurin Mayaki" w:date="2026-01-12T17:01:00Z" w16du:dateUtc="2026-01-12T17:01:00Z"/>
+                <w:del w:id="158" w:author="Alfred Anate Bodurin Mayaki" w:date="2026-01-12T17:01:00Z" w16du:dateUtc="2026-01-12T17:01:00Z"/>
                 <w:rFonts w:ascii="CMU Sans Serif" w:hAnsi="CMU Sans Serif" w:cs="CMU Sans Serif"/>
                 <w:color w:val="000000" w:themeColor="text1"/>
                 <w:sz w:val="20"/>
                 <w:szCs w:val="20"/>
               </w:rPr>
             </w:pPr>
-            <w:del w:id="158" w:author="Alfred Anate Bodurin Mayaki" w:date="2026-01-12T17:01:00Z" w16du:dateUtc="2026-01-12T17:01:00Z">
+            <w:del w:id="159" w:author="Alfred Anate Bodurin Mayaki" w:date="2026-01-12T17:01:00Z" w16du:dateUtc="2026-01-12T17:01:00Z">
               <w:r>
                 <w:rPr>
                   <w:rFonts w:ascii="CMU Sans Serif" w:hAnsi="CMU Sans Serif" w:cs="CMU Sans Serif"/>
@@ -7056,14 +7089,14 @@
               <w:jc w:val="both"/>
               <w:cnfStyle w:val="000000000000" w:firstRow="0" w:lastRow="0" w:firstColumn="0" w:lastColumn="0" w:oddVBand="0" w:evenVBand="0" w:oddHBand="0" w:evenHBand="0" w:firstRowFirstColumn="0" w:firstRowLastColumn="0" w:lastRowFirstColumn="0" w:lastRowLastColumn="0"/>
               <w:rPr>
-                <w:del w:id="159" w:author="Alfred Anate Bodurin Mayaki" w:date="2026-01-12T17:01:00Z" w16du:dateUtc="2026-01-12T17:01:00Z"/>
+                <w:del w:id="160" w:author="Alfred Anate Bodurin Mayaki" w:date="2026-01-12T17:01:00Z" w16du:dateUtc="2026-01-12T17:01:00Z"/>
                 <w:rFonts w:ascii="CMU Sans Serif" w:hAnsi="CMU Sans Serif" w:cs="CMU Sans Serif"/>
                 <w:color w:val="000000" w:themeColor="text1"/>
                 <w:sz w:val="20"/>
                 <w:szCs w:val="20"/>
               </w:rPr>
             </w:pPr>
-            <w:del w:id="160" w:author="Alfred Anate Bodurin Mayaki" w:date="2026-01-12T17:01:00Z" w16du:dateUtc="2026-01-12T17:01:00Z">
+            <w:del w:id="161" w:author="Alfred Anate Bodurin Mayaki" w:date="2026-01-12T17:01:00Z" w16du:dateUtc="2026-01-12T17:01:00Z">
               <w:r>
                 <w:rPr>
                   <w:rFonts w:ascii="CMU Sans Serif" w:hAnsi="CMU Sans Serif" w:cs="CMU Sans Serif"/>
@@ -7100,7 +7133,7 @@
       <w:tr>
         <w:trPr>
           <w:cnfStyle w:val="000000100000" w:firstRow="0" w:lastRow="0" w:firstColumn="0" w:lastColumn="0" w:oddVBand="0" w:evenVBand="0" w:oddHBand="1" w:evenHBand="0" w:firstRowFirstColumn="0" w:firstRowLastColumn="0" w:lastRowFirstColumn="0" w:lastRowLastColumn="0"/>
-          <w:del w:id="161" w:author="Alfred Anate Bodurin Mayaki" w:date="2026-01-12T17:01:00Z"/>
+          <w:del w:id="162" w:author="Alfred Anate Bodurin Mayaki" w:date="2026-01-12T17:01:00Z"/>
         </w:trPr>
         <w:tc>
           <w:tcPr>
@@ -7111,14 +7144,14 @@
             <w:pPr>
               <w:jc w:val="both"/>
               <w:rPr>
-                <w:del w:id="162" w:author="Alfred Anate Bodurin Mayaki" w:date="2026-01-12T17:01:00Z" w16du:dateUtc="2026-01-12T17:01:00Z"/>
+                <w:del w:id="163" w:author="Alfred Anate Bodurin Mayaki" w:date="2026-01-12T17:01:00Z" w16du:dateUtc="2026-01-12T17:01:00Z"/>
                 <w:rFonts w:ascii="CMU Sans Serif" w:hAnsi="CMU Sans Serif" w:cs="CMU Sans Serif"/>
                 <w:color w:val="000000" w:themeColor="text1"/>
                 <w:sz w:val="20"/>
                 <w:szCs w:val="20"/>
               </w:rPr>
             </w:pPr>
-            <w:del w:id="163" w:author="Alfred Anate Bodurin Mayaki" w:date="2026-01-12T17:01:00Z" w16du:dateUtc="2026-01-12T17:01:00Z">
+            <w:del w:id="164" w:author="Alfred Anate Bodurin Mayaki" w:date="2026-01-12T17:01:00Z" w16du:dateUtc="2026-01-12T17:01:00Z">
               <w:r>
                 <w:rPr>
                   <w:rFonts w:ascii="CMU Sans Serif" w:hAnsi="CMU Sans Serif" w:cs="CMU Sans Serif"/>
@@ -7140,14 +7173,14 @@
               <w:jc w:val="both"/>
               <w:cnfStyle w:val="000000100000" w:firstRow="0" w:lastRow="0" w:firstColumn="0" w:lastColumn="0" w:oddVBand="0" w:evenVBand="0" w:oddHBand="1" w:evenHBand="0" w:firstRowFirstColumn="0" w:firstRowLastColumn="0" w:lastRowFirstColumn="0" w:lastRowLastColumn="0"/>
               <w:rPr>
-                <w:del w:id="164" w:author="Alfred Anate Bodurin Mayaki" w:date="2026-01-12T17:01:00Z" w16du:dateUtc="2026-01-12T17:01:00Z"/>
+                <w:del w:id="165" w:author="Alfred Anate Bodurin Mayaki" w:date="2026-01-12T17:01:00Z" w16du:dateUtc="2026-01-12T17:01:00Z"/>
                 <w:rFonts w:ascii="CMU Sans Serif" w:hAnsi="CMU Sans Serif" w:cs="CMU Sans Serif"/>
                 <w:color w:val="000000" w:themeColor="text1"/>
                 <w:sz w:val="20"/>
                 <w:szCs w:val="20"/>
               </w:rPr>
             </w:pPr>
-            <w:del w:id="165" w:author="Alfred Anate Bodurin Mayaki" w:date="2026-01-12T17:01:00Z" w16du:dateUtc="2026-01-12T17:01:00Z">
+            <w:del w:id="166" w:author="Alfred Anate Bodurin Mayaki" w:date="2026-01-12T17:01:00Z" w16du:dateUtc="2026-01-12T17:01:00Z">
               <w:r>
                 <w:rPr>
                   <w:rFonts w:ascii="CMU Sans Serif" w:hAnsi="CMU Sans Serif" w:cs="CMU Sans Serif"/>
@@ -7169,14 +7202,14 @@
               <w:jc w:val="both"/>
               <w:cnfStyle w:val="000000100000" w:firstRow="0" w:lastRow="0" w:firstColumn="0" w:lastColumn="0" w:oddVBand="0" w:evenVBand="0" w:oddHBand="1" w:evenHBand="0" w:firstRowFirstColumn="0" w:firstRowLastColumn="0" w:lastRowFirstColumn="0" w:lastRowLastColumn="0"/>
               <w:rPr>
-                <w:del w:id="166" w:author="Alfred Anate Bodurin Mayaki" w:date="2026-01-12T17:01:00Z" w16du:dateUtc="2026-01-12T17:01:00Z"/>
+                <w:del w:id="167" w:author="Alfred Anate Bodurin Mayaki" w:date="2026-01-12T17:01:00Z" w16du:dateUtc="2026-01-12T17:01:00Z"/>
                 <w:rFonts w:ascii="CMU Sans Serif" w:hAnsi="CMU Sans Serif" w:cs="CMU Sans Serif"/>
                 <w:color w:val="000000" w:themeColor="text1"/>
                 <w:sz w:val="20"/>
                 <w:szCs w:val="20"/>
               </w:rPr>
             </w:pPr>
-            <w:del w:id="167" w:author="Alfred Anate Bodurin Mayaki" w:date="2026-01-12T17:01:00Z" w16du:dateUtc="2026-01-12T17:01:00Z">
+            <w:del w:id="168" w:author="Alfred Anate Bodurin Mayaki" w:date="2026-01-12T17:01:00Z" w16du:dateUtc="2026-01-12T17:01:00Z">
               <w:r>
                 <w:rPr>
                   <w:rFonts w:ascii="CMU Sans Serif" w:hAnsi="CMU Sans Serif" w:cs="CMU Sans Serif"/>
@@ -7192,7 +7225,7 @@
       </w:tr>
       <w:tr>
         <w:trPr>
-          <w:del w:id="168" w:author="Alfred Anate Bodurin Mayaki" w:date="2026-01-12T17:01:00Z"/>
+          <w:del w:id="169" w:author="Alfred Anate Bodurin Mayaki" w:date="2026-01-12T17:01:00Z"/>
         </w:trPr>
         <w:tc>
           <w:tcPr>
@@ -7203,14 +7236,14 @@
             <w:pPr>
               <w:jc w:val="both"/>
               <w:rPr>
-                <w:del w:id="169" w:author="Alfred Anate Bodurin Mayaki" w:date="2026-01-12T17:01:00Z" w16du:dateUtc="2026-01-12T17:01:00Z"/>
+                <w:del w:id="170" w:author="Alfred Anate Bodurin Mayaki" w:date="2026-01-12T17:01:00Z" w16du:dateUtc="2026-01-12T17:01:00Z"/>
                 <w:rFonts w:ascii="CMU Sans Serif" w:hAnsi="CMU Sans Serif" w:cs="CMU Sans Serif"/>
                 <w:color w:val="000000" w:themeColor="text1"/>
                 <w:sz w:val="20"/>
                 <w:szCs w:val="20"/>
               </w:rPr>
             </w:pPr>
-            <w:del w:id="170" w:author="Alfred Anate Bodurin Mayaki" w:date="2026-01-12T17:01:00Z" w16du:dateUtc="2026-01-12T17:01:00Z">
+            <w:del w:id="171" w:author="Alfred Anate Bodurin Mayaki" w:date="2026-01-12T17:01:00Z" w16du:dateUtc="2026-01-12T17:01:00Z">
               <w:r>
                 <w:rPr>
                   <w:rFonts w:ascii="CMU Sans Serif" w:hAnsi="CMU Sans Serif" w:cs="CMU Sans Serif"/>
@@ -7232,14 +7265,14 @@
               <w:jc w:val="both"/>
               <w:cnfStyle w:val="000000000000" w:firstRow="0" w:lastRow="0" w:firstColumn="0" w:lastColumn="0" w:oddVBand="0" w:evenVBand="0" w:oddHBand="0" w:evenHBand="0" w:firstRowFirstColumn="0" w:firstRowLastColumn="0" w:lastRowFirstColumn="0" w:lastRowLastColumn="0"/>
               <w:rPr>
-                <w:del w:id="171" w:author="Alfred Anate Bodurin Mayaki" w:date="2026-01-12T17:01:00Z" w16du:dateUtc="2026-01-12T17:01:00Z"/>
+                <w:del w:id="172" w:author="Alfred Anate Bodurin Mayaki" w:date="2026-01-12T17:01:00Z" w16du:dateUtc="2026-01-12T17:01:00Z"/>
                 <w:rFonts w:ascii="CMU Sans Serif" w:hAnsi="CMU Sans Serif" w:cs="CMU Sans Serif"/>
                 <w:color w:val="000000" w:themeColor="text1"/>
                 <w:sz w:val="20"/>
                 <w:szCs w:val="20"/>
               </w:rPr>
             </w:pPr>
-            <w:del w:id="172" w:author="Alfred Anate Bodurin Mayaki" w:date="2026-01-12T17:01:00Z" w16du:dateUtc="2026-01-12T17:01:00Z">
+            <w:del w:id="173" w:author="Alfred Anate Bodurin Mayaki" w:date="2026-01-12T17:01:00Z" w16du:dateUtc="2026-01-12T17:01:00Z">
               <w:r>
                 <w:rPr>
                   <w:rFonts w:ascii="CMU Sans Serif" w:hAnsi="CMU Sans Serif" w:cs="CMU Sans Serif"/>
@@ -7261,14 +7294,14 @@
               <w:jc w:val="both"/>
               <w:cnfStyle w:val="000000000000" w:firstRow="0" w:lastRow="0" w:firstColumn="0" w:lastColumn="0" w:oddVBand="0" w:evenVBand="0" w:oddHBand="0" w:evenHBand="0" w:firstRowFirstColumn="0" w:firstRowLastColumn="0" w:lastRowFirstColumn="0" w:lastRowLastColumn="0"/>
               <w:rPr>
-                <w:del w:id="173" w:author="Alfred Anate Bodurin Mayaki" w:date="2026-01-12T17:01:00Z" w16du:dateUtc="2026-01-12T17:01:00Z"/>
+                <w:del w:id="174" w:author="Alfred Anate Bodurin Mayaki" w:date="2026-01-12T17:01:00Z" w16du:dateUtc="2026-01-12T17:01:00Z"/>
                 <w:rFonts w:ascii="CMU Sans Serif" w:hAnsi="CMU Sans Serif" w:cs="CMU Sans Serif"/>
                 <w:color w:val="000000" w:themeColor="text1"/>
                 <w:sz w:val="20"/>
                 <w:szCs w:val="20"/>
               </w:rPr>
             </w:pPr>
-            <w:del w:id="174" w:author="Alfred Anate Bodurin Mayaki" w:date="2026-01-12T17:01:00Z" w16du:dateUtc="2026-01-12T17:01:00Z">
+            <w:del w:id="175" w:author="Alfred Anate Bodurin Mayaki" w:date="2026-01-12T17:01:00Z" w16du:dateUtc="2026-01-12T17:01:00Z">
               <w:r>
                 <w:rPr>
                   <w:rFonts w:ascii="CMU Sans Serif" w:hAnsi="CMU Sans Serif" w:cs="CMU Sans Serif"/>
@@ -7307,7 +7340,7 @@
       <w:pPr>
         <w:jc w:val="both"/>
         <w:rPr>
-          <w:del w:id="175" w:author="Alfred Anate Bodurin Mayaki" w:date="2026-01-12T17:01:00Z" w16du:dateUtc="2026-01-12T17:01:00Z"/>
+          <w:del w:id="176" w:author="Alfred Anate Bodurin Mayaki" w:date="2026-01-12T17:01:00Z" w16du:dateUtc="2026-01-12T17:01:00Z"/>
           <w:rFonts w:ascii="CMU Sans Serif" w:hAnsi="CMU Sans Serif" w:cs="CMU Sans Serif"/>
           <w:color w:val="000000" w:themeColor="text1"/>
         </w:rPr>
@@ -7610,7 +7643,27 @@
                 <w:sz w:val="20"/>
                 <w:szCs w:val="20"/>
               </w:rPr>
-              <w:t>Dutta &amp; Adsule (2025)</w:t>
+              <w:t xml:space="preserve">Dutta &amp; </w:t>
+            </w:r>
+            <w:proofErr w:type="spellStart"/>
+            <w:r>
+              <w:rPr>
+                <w:rFonts w:ascii="CMU Sans Serif" w:hAnsi="CMU Sans Serif" w:cs="CMU Sans Serif"/>
+                <w:color w:val="000000" w:themeColor="text1"/>
+                <w:sz w:val="20"/>
+                <w:szCs w:val="20"/>
+              </w:rPr>
+              <w:t>Adsule</w:t>
+            </w:r>
+            <w:proofErr w:type="spellEnd"/>
+            <w:r>
+              <w:rPr>
+                <w:rFonts w:ascii="CMU Sans Serif" w:hAnsi="CMU Sans Serif" w:cs="CMU Sans Serif"/>
+                <w:color w:val="000000" w:themeColor="text1"/>
+                <w:sz w:val="20"/>
+                <w:szCs w:val="20"/>
+              </w:rPr>
+              <w:t xml:space="preserve"> (2025)</w:t>
             </w:r>
           </w:p>
         </w:tc>
@@ -7686,14 +7739,25 @@
                 <w:szCs w:val="20"/>
               </w:rPr>
             </w:pPr>
-            <w:r>
-              <w:rPr>
-                <w:rFonts w:ascii="CMU Sans Serif" w:hAnsi="CMU Sans Serif" w:cs="CMU Sans Serif"/>
-                <w:color w:val="000000" w:themeColor="text1"/>
-                <w:sz w:val="20"/>
-                <w:szCs w:val="20"/>
-              </w:rPr>
-              <w:t>Lup and Canonico (2024)</w:t>
+            <w:proofErr w:type="spellStart"/>
+            <w:r>
+              <w:rPr>
+                <w:rFonts w:ascii="CMU Sans Serif" w:hAnsi="CMU Sans Serif" w:cs="CMU Sans Serif"/>
+                <w:color w:val="000000" w:themeColor="text1"/>
+                <w:sz w:val="20"/>
+                <w:szCs w:val="20"/>
+              </w:rPr>
+              <w:t>Lup</w:t>
+            </w:r>
+            <w:proofErr w:type="spellEnd"/>
+            <w:r>
+              <w:rPr>
+                <w:rFonts w:ascii="CMU Sans Serif" w:hAnsi="CMU Sans Serif" w:cs="CMU Sans Serif"/>
+                <w:color w:val="000000" w:themeColor="text1"/>
+                <w:sz w:val="20"/>
+                <w:szCs w:val="20"/>
+              </w:rPr>
+              <w:t xml:space="preserve"> and Canonico (2024)</w:t>
             </w:r>
           </w:p>
         </w:tc>
@@ -7826,7 +7890,7 @@
         </w:rPr>
         <w:t>Theo</w:t>
       </w:r>
-      <w:ins w:id="176" w:author="Alfred Anate Bodurin Mayaki" w:date="2026-01-12T17:01:00Z" w16du:dateUtc="2026-01-12T17:01:00Z">
+      <w:ins w:id="177" w:author="Alfred Anate Bodurin Mayaki" w:date="2026-01-12T17:01:00Z" w16du:dateUtc="2026-01-12T17:01:00Z">
         <w:r>
           <w:rPr>
             <w:rFonts w:ascii="CMU Sans Serif" w:hAnsi="CMU Sans Serif" w:cs="CMU Sans Serif"/>
@@ -7836,7 +7900,7 @@
           <w:t>ry and Signalling Theory</w:t>
         </w:r>
       </w:ins>
-      <w:del w:id="177" w:author="Alfred Anate Bodurin Mayaki" w:date="2026-01-12T17:01:00Z" w16du:dateUtc="2026-01-12T17:01:00Z">
+      <w:del w:id="178" w:author="Alfred Anate Bodurin Mayaki" w:date="2026-01-12T17:01:00Z" w16du:dateUtc="2026-01-12T17:01:00Z">
         <w:r>
           <w:rPr>
             <w:rFonts w:ascii="CMU Sans Serif" w:hAnsi="CMU Sans Serif" w:cs="CMU Sans Serif"/>
@@ -8137,7 +8201,7 @@
                 <w:szCs w:val="20"/>
               </w:rPr>
             </w:pPr>
-            <w:del w:id="178" w:author="Alfred Anate Bodurin Mayaki" w:date="2026-01-12T16:57:00Z" w16du:dateUtc="2026-01-12T16:57:00Z">
+            <w:del w:id="179" w:author="Alfred Anate Bodurin Mayaki" w:date="2026-01-12T16:57:00Z" w16du:dateUtc="2026-01-12T16:57:00Z">
               <w:r>
                 <w:fldChar w:fldCharType="begin"/>
               </w:r>
@@ -8149,7 +8213,7 @@
               </w:r>
               <w:r>
                 <w:rPr>
-                  <w:rPrChange w:id="179" w:author="Alfred Anate Bodurin Mayaki" w:date="2026-01-12T16:57:00Z" w16du:dateUtc="2026-01-12T16:57:00Z">
+                  <w:rPrChange w:id="180" w:author="Alfred Anate Bodurin Mayaki" w:date="2026-01-12T16:57:00Z" w16du:dateUtc="2026-01-12T16:57:00Z">
                     <w:rPr>
                       <w:rStyle w:val="Hyperlink"/>
                       <w:rFonts w:ascii="CMU Sans Serif" w:hAnsi="CMU Sans Serif" w:cs="CMU Sans Serif"/>
@@ -8164,10 +8228,10 @@
                 <w:fldChar w:fldCharType="end"/>
               </w:r>
             </w:del>
-            <w:ins w:id="180" w:author="Alfred Anate Bodurin Mayaki" w:date="2026-01-12T16:57:00Z" w16du:dateUtc="2026-01-12T16:57:00Z">
+            <w:ins w:id="181" w:author="Alfred Anate Bodurin Mayaki" w:date="2026-01-12T16:57:00Z" w16du:dateUtc="2026-01-12T16:57:00Z">
               <w:r>
                 <w:rPr>
-                  <w:rPrChange w:id="181" w:author="Alfred Anate Bodurin Mayaki" w:date="2026-01-12T16:57:00Z" w16du:dateUtc="2026-01-12T16:57:00Z">
+                  <w:rPrChange w:id="182" w:author="Alfred Anate Bodurin Mayaki" w:date="2026-01-12T16:57:00Z" w16du:dateUtc="2026-01-12T16:57:00Z">
                     <w:rPr>
                       <w:rStyle w:val="Hyperlink"/>
                       <w:rFonts w:ascii="CMU Sans Serif" w:hAnsi="CMU Sans Serif" w:cs="CMU Sans Serif"/>
@@ -8196,7 +8260,7 @@
                 <w:szCs w:val="20"/>
               </w:rPr>
             </w:pPr>
-            <w:del w:id="182" w:author="Alfred Anate Bodurin Mayaki" w:date="2026-01-12T16:57:00Z" w16du:dateUtc="2026-01-12T16:57:00Z">
+            <w:del w:id="183" w:author="Alfred Anate Bodurin Mayaki" w:date="2026-01-12T16:57:00Z" w16du:dateUtc="2026-01-12T16:57:00Z">
               <w:r>
                 <w:fldChar w:fldCharType="begin"/>
               </w:r>
@@ -8208,7 +8272,7 @@
               </w:r>
               <w:r>
                 <w:rPr>
-                  <w:rPrChange w:id="183" w:author="Alfred Anate Bodurin Mayaki" w:date="2026-01-12T16:57:00Z" w16du:dateUtc="2026-01-12T16:57:00Z">
+                  <w:rPrChange w:id="184" w:author="Alfred Anate Bodurin Mayaki" w:date="2026-01-12T16:57:00Z" w16du:dateUtc="2026-01-12T16:57:00Z">
                     <w:rPr>
                       <w:rStyle w:val="Hyperlink"/>
                       <w:rFonts w:ascii="CMU Sans Serif" w:hAnsi="CMU Sans Serif" w:cs="CMU Sans Serif"/>
@@ -8223,10 +8287,10 @@
                 <w:fldChar w:fldCharType="end"/>
               </w:r>
             </w:del>
-            <w:ins w:id="184" w:author="Alfred Anate Bodurin Mayaki" w:date="2026-01-12T16:57:00Z" w16du:dateUtc="2026-01-12T16:57:00Z">
+            <w:ins w:id="185" w:author="Alfred Anate Bodurin Mayaki" w:date="2026-01-12T16:57:00Z" w16du:dateUtc="2026-01-12T16:57:00Z">
               <w:r>
                 <w:rPr>
-                  <w:rPrChange w:id="185" w:author="Alfred Anate Bodurin Mayaki" w:date="2026-01-12T16:57:00Z" w16du:dateUtc="2026-01-12T16:57:00Z">
+                  <w:rPrChange w:id="186" w:author="Alfred Anate Bodurin Mayaki" w:date="2026-01-12T16:57:00Z" w16du:dateUtc="2026-01-12T16:57:00Z">
                     <w:rPr>
                       <w:rStyle w:val="Hyperlink"/>
                       <w:rFonts w:ascii="CMU Sans Serif" w:hAnsi="CMU Sans Serif" w:cs="CMU Sans Serif"/>
@@ -8255,7 +8319,7 @@
                 <w:szCs w:val="20"/>
               </w:rPr>
             </w:pPr>
-            <w:del w:id="186" w:author="Alfred Anate Bodurin Mayaki" w:date="2026-01-12T16:57:00Z" w16du:dateUtc="2026-01-12T16:57:00Z">
+            <w:del w:id="187" w:author="Alfred Anate Bodurin Mayaki" w:date="2026-01-12T16:57:00Z" w16du:dateUtc="2026-01-12T16:57:00Z">
               <w:r>
                 <w:fldChar w:fldCharType="begin"/>
               </w:r>
@@ -8267,7 +8331,7 @@
               </w:r>
               <w:r>
                 <w:rPr>
-                  <w:rPrChange w:id="187" w:author="Alfred Anate Bodurin Mayaki" w:date="2026-01-12T16:57:00Z" w16du:dateUtc="2026-01-12T16:57:00Z">
+                  <w:rPrChange w:id="188" w:author="Alfred Anate Bodurin Mayaki" w:date="2026-01-12T16:57:00Z" w16du:dateUtc="2026-01-12T16:57:00Z">
                     <w:rPr>
                       <w:rStyle w:val="Hyperlink"/>
                       <w:rFonts w:ascii="CMU Sans Serif" w:hAnsi="CMU Sans Serif" w:cs="CMU Sans Serif"/>
@@ -8282,10 +8346,10 @@
                 <w:fldChar w:fldCharType="end"/>
               </w:r>
             </w:del>
-            <w:ins w:id="188" w:author="Alfred Anate Bodurin Mayaki" w:date="2026-01-12T16:57:00Z" w16du:dateUtc="2026-01-12T16:57:00Z">
+            <w:ins w:id="189" w:author="Alfred Anate Bodurin Mayaki" w:date="2026-01-12T16:57:00Z" w16du:dateUtc="2026-01-12T16:57:00Z">
               <w:r>
                 <w:rPr>
-                  <w:rPrChange w:id="189" w:author="Alfred Anate Bodurin Mayaki" w:date="2026-01-12T16:57:00Z" w16du:dateUtc="2026-01-12T16:57:00Z">
+                  <w:rPrChange w:id="190" w:author="Alfred Anate Bodurin Mayaki" w:date="2026-01-12T16:57:00Z" w16du:dateUtc="2026-01-12T16:57:00Z">
                     <w:rPr>
                       <w:rStyle w:val="Hyperlink"/>
                       <w:rFonts w:ascii="CMU Sans Serif" w:hAnsi="CMU Sans Serif" w:cs="CMU Sans Serif"/>
@@ -8386,7 +8450,7 @@
         <w:pStyle w:val="ListParagraph"/>
         <w:jc w:val="both"/>
         <w:rPr>
-          <w:del w:id="190" w:author="Alfred Anate Bodurin Mayaki" w:date="2026-01-12T17:00:00Z" w16du:dateUtc="2026-01-12T17:00:00Z"/>
+          <w:del w:id="191" w:author="Alfred Anate Bodurin Mayaki" w:date="2026-01-12T17:00:00Z" w16du:dateUtc="2026-01-12T17:00:00Z"/>
           <w:rFonts w:ascii="CMU Sans Serif" w:hAnsi="CMU Sans Serif" w:cs="CMU Sans Serif"/>
           <w:color w:val="000000" w:themeColor="text1"/>
           <w:u w:val="single"/>
@@ -8400,11 +8464,11 @@
           <w:rFonts w:ascii="CMU Sans Serif" w:hAnsi="CMU Sans Serif" w:cs="CMU Sans Serif"/>
           <w:color w:val="000000" w:themeColor="text1"/>
           <w:u w:val="single"/>
-          <w:rPrChange w:id="191" w:author="Alfred Anate Bodurin Mayaki" w:date="2026-01-12T17:00:00Z" w16du:dateUtc="2026-01-12T17:00:00Z">
+          <w:rPrChange w:id="192" w:author="Alfred Anate Bodurin Mayaki" w:date="2026-01-12T17:00:00Z" w16du:dateUtc="2026-01-12T17:00:00Z">
             <w:rPr/>
           </w:rPrChange>
         </w:rPr>
-        <w:pPrChange w:id="192" w:author="Alfred Anate Bodurin Mayaki" w:date="2026-01-12T17:00:00Z" w16du:dateUtc="2026-01-12T17:00:00Z">
+        <w:pPrChange w:id="193" w:author="Alfred Anate Bodurin Mayaki" w:date="2026-01-12T17:00:00Z" w16du:dateUtc="2026-01-12T17:00:00Z">
           <w:pPr>
             <w:pStyle w:val="ListParagraph"/>
             <w:numPr>
@@ -8415,13 +8479,13 @@
           </w:pPr>
         </w:pPrChange>
       </w:pPr>
-      <w:del w:id="193" w:author="Alfred Anate Bodurin Mayaki" w:date="2026-01-12T17:00:00Z" w16du:dateUtc="2026-01-12T17:00:00Z">
+      <w:del w:id="194" w:author="Alfred Anate Bodurin Mayaki" w:date="2026-01-12T17:00:00Z" w16du:dateUtc="2026-01-12T17:00:00Z">
         <w:r>
           <w:rPr>
             <w:rFonts w:ascii="CMU Sans Serif" w:hAnsi="CMU Sans Serif" w:cs="CMU Sans Serif"/>
             <w:color w:val="000000" w:themeColor="text1"/>
             <w:u w:val="single"/>
-            <w:rPrChange w:id="194" w:author="Alfred Anate Bodurin Mayaki" w:date="2026-01-12T17:00:00Z" w16du:dateUtc="2026-01-12T17:00:00Z">
+            <w:rPrChange w:id="195" w:author="Alfred Anate Bodurin Mayaki" w:date="2026-01-12T17:00:00Z" w16du:dateUtc="2026-01-12T17:00:00Z">
               <w:rPr/>
             </w:rPrChange>
           </w:rPr>
@@ -8439,7 +8503,7 @@
         <w:gridCol w:w="2036"/>
         <w:gridCol w:w="4063"/>
         <w:gridCol w:w="2927"/>
-        <w:tblGridChange w:id="195">
+        <w:tblGridChange w:id="196">
           <w:tblGrid>
             <w:gridCol w:w="1838"/>
             <w:gridCol w:w="198"/>
@@ -8453,7 +8517,7 @@
       <w:tr>
         <w:trPr>
           <w:cnfStyle w:val="100000000000" w:firstRow="1" w:lastRow="0" w:firstColumn="0" w:lastColumn="0" w:oddVBand="0" w:evenVBand="0" w:oddHBand="0" w:evenHBand="0" w:firstRowFirstColumn="0" w:firstRowLastColumn="0" w:lastRowFirstColumn="0" w:lastRowLastColumn="0"/>
-          <w:del w:id="196" w:author="Alfred Anate Bodurin Mayaki" w:date="2026-01-12T17:01:00Z"/>
+          <w:del w:id="197" w:author="Alfred Anate Bodurin Mayaki" w:date="2026-01-12T17:01:00Z"/>
         </w:trPr>
         <w:tc>
           <w:tcPr>
@@ -8464,7 +8528,7 @@
             <w:pPr>
               <w:jc w:val="both"/>
               <w:rPr>
-                <w:del w:id="197" w:author="Alfred Anate Bodurin Mayaki" w:date="2026-01-12T17:01:00Z" w16du:dateUtc="2026-01-12T17:01:00Z"/>
+                <w:del w:id="198" w:author="Alfred Anate Bodurin Mayaki" w:date="2026-01-12T17:01:00Z" w16du:dateUtc="2026-01-12T17:01:00Z"/>
                 <w:rFonts w:ascii="CMU Sans Serif" w:hAnsi="CMU Sans Serif" w:cs="CMU Sans Serif"/>
                 <w:b w:val="0"/>
                 <w:bCs w:val="0"/>
@@ -8473,7 +8537,7 @@
                 <w:szCs w:val="20"/>
               </w:rPr>
             </w:pPr>
-            <w:del w:id="198" w:author="Alfred Anate Bodurin Mayaki" w:date="2026-01-12T17:01:00Z" w16du:dateUtc="2026-01-12T17:01:00Z">
+            <w:del w:id="199" w:author="Alfred Anate Bodurin Mayaki" w:date="2026-01-12T17:01:00Z" w16du:dateUtc="2026-01-12T17:01:00Z">
               <w:r>
                 <w:rPr>
                   <w:rFonts w:ascii="CMU Sans Serif" w:hAnsi="CMU Sans Serif" w:cs="CMU Sans Serif"/>
@@ -8498,7 +8562,7 @@
               <w:jc w:val="both"/>
               <w:cnfStyle w:val="100000000000" w:firstRow="1" w:lastRow="0" w:firstColumn="0" w:lastColumn="0" w:oddVBand="0" w:evenVBand="0" w:oddHBand="0" w:evenHBand="0" w:firstRowFirstColumn="0" w:firstRowLastColumn="0" w:lastRowFirstColumn="0" w:lastRowLastColumn="0"/>
               <w:rPr>
-                <w:del w:id="199" w:author="Alfred Anate Bodurin Mayaki" w:date="2026-01-12T17:01:00Z" w16du:dateUtc="2026-01-12T17:01:00Z"/>
+                <w:del w:id="200" w:author="Alfred Anate Bodurin Mayaki" w:date="2026-01-12T17:01:00Z" w16du:dateUtc="2026-01-12T17:01:00Z"/>
                 <w:rFonts w:ascii="CMU Sans Serif" w:hAnsi="CMU Sans Serif" w:cs="CMU Sans Serif"/>
                 <w:b w:val="0"/>
                 <w:bCs w:val="0"/>
@@ -8507,7 +8571,7 @@
                 <w:szCs w:val="20"/>
               </w:rPr>
             </w:pPr>
-            <w:del w:id="200" w:author="Alfred Anate Bodurin Mayaki" w:date="2026-01-12T17:01:00Z" w16du:dateUtc="2026-01-12T17:01:00Z">
+            <w:del w:id="201" w:author="Alfred Anate Bodurin Mayaki" w:date="2026-01-12T17:01:00Z" w16du:dateUtc="2026-01-12T17:01:00Z">
               <w:r>
                 <w:rPr>
                   <w:rFonts w:ascii="CMU Sans Serif" w:hAnsi="CMU Sans Serif" w:cs="CMU Sans Serif"/>
@@ -8538,7 +8602,7 @@
               <w:jc w:val="both"/>
               <w:cnfStyle w:val="100000000000" w:firstRow="1" w:lastRow="0" w:firstColumn="0" w:lastColumn="0" w:oddVBand="0" w:evenVBand="0" w:oddHBand="0" w:evenHBand="0" w:firstRowFirstColumn="0" w:firstRowLastColumn="0" w:lastRowFirstColumn="0" w:lastRowLastColumn="0"/>
               <w:rPr>
-                <w:del w:id="201" w:author="Alfred Anate Bodurin Mayaki" w:date="2026-01-12T17:01:00Z" w16du:dateUtc="2026-01-12T17:01:00Z"/>
+                <w:del w:id="202" w:author="Alfred Anate Bodurin Mayaki" w:date="2026-01-12T17:01:00Z" w16du:dateUtc="2026-01-12T17:01:00Z"/>
                 <w:rFonts w:ascii="CMU Sans Serif" w:hAnsi="CMU Sans Serif" w:cs="CMU Sans Serif"/>
                 <w:b w:val="0"/>
                 <w:bCs w:val="0"/>
@@ -8547,7 +8611,7 @@
                 <w:szCs w:val="20"/>
               </w:rPr>
             </w:pPr>
-            <w:del w:id="202" w:author="Alfred Anate Bodurin Mayaki" w:date="2026-01-12T17:01:00Z" w16du:dateUtc="2026-01-12T17:01:00Z">
+            <w:del w:id="203" w:author="Alfred Anate Bodurin Mayaki" w:date="2026-01-12T17:01:00Z" w16du:dateUtc="2026-01-12T17:01:00Z">
               <w:r>
                 <w:rPr>
                   <w:rFonts w:ascii="CMU Sans Serif" w:hAnsi="CMU Sans Serif" w:cs="CMU Sans Serif"/>
@@ -8580,7 +8644,7 @@
                 <w:szCs w:val="20"/>
               </w:rPr>
             </w:pPr>
-            <w:del w:id="203" w:author="Alfred Anate Bodurin Mayaki" w:date="2026-01-12T16:57:00Z" w16du:dateUtc="2026-01-12T16:57:00Z">
+            <w:del w:id="204" w:author="Alfred Anate Bodurin Mayaki" w:date="2026-01-12T16:57:00Z" w16du:dateUtc="2026-01-12T16:57:00Z">
               <w:r>
                 <w:fldChar w:fldCharType="begin"/>
               </w:r>
@@ -8592,7 +8656,7 @@
               </w:r>
               <w:r>
                 <w:rPr>
-                  <w:rPrChange w:id="204" w:author="Alfred Anate Bodurin Mayaki" w:date="2026-01-12T16:57:00Z" w16du:dateUtc="2026-01-12T16:57:00Z">
+                  <w:rPrChange w:id="205" w:author="Alfred Anate Bodurin Mayaki" w:date="2026-01-12T16:57:00Z" w16du:dateUtc="2026-01-12T16:57:00Z">
                     <w:rPr>
                       <w:rStyle w:val="Hyperlink"/>
                       <w:rFonts w:ascii="CMU Sans Serif" w:hAnsi="CMU Sans Serif" w:cs="CMU Sans Serif"/>
@@ -8607,10 +8671,10 @@
                 <w:fldChar w:fldCharType="end"/>
               </w:r>
             </w:del>
-            <w:ins w:id="205" w:author="Alfred Anate Bodurin Mayaki" w:date="2026-01-12T16:57:00Z" w16du:dateUtc="2026-01-12T16:57:00Z">
+            <w:ins w:id="206" w:author="Alfred Anate Bodurin Mayaki" w:date="2026-01-12T16:57:00Z" w16du:dateUtc="2026-01-12T16:57:00Z">
               <w:r>
                 <w:rPr>
-                  <w:rPrChange w:id="206" w:author="Alfred Anate Bodurin Mayaki" w:date="2026-01-12T16:57:00Z" w16du:dateUtc="2026-01-12T16:57:00Z">
+                  <w:rPrChange w:id="207" w:author="Alfred Anate Bodurin Mayaki" w:date="2026-01-12T16:57:00Z" w16du:dateUtc="2026-01-12T16:57:00Z">
                     <w:rPr>
                       <w:rStyle w:val="Hyperlink"/>
                       <w:rFonts w:ascii="CMU Sans Serif" w:hAnsi="CMU Sans Serif" w:cs="CMU Sans Serif"/>
@@ -8639,7 +8703,7 @@
                 <w:szCs w:val="20"/>
               </w:rPr>
             </w:pPr>
-            <w:del w:id="207" w:author="Alfred Anate Bodurin Mayaki" w:date="2026-01-12T16:57:00Z" w16du:dateUtc="2026-01-12T16:57:00Z">
+            <w:del w:id="208" w:author="Alfred Anate Bodurin Mayaki" w:date="2026-01-12T16:57:00Z" w16du:dateUtc="2026-01-12T16:57:00Z">
               <w:r>
                 <w:fldChar w:fldCharType="begin"/>
               </w:r>
@@ -8651,7 +8715,7 @@
               </w:r>
               <w:r>
                 <w:rPr>
-                  <w:rPrChange w:id="208" w:author="Alfred Anate Bodurin Mayaki" w:date="2026-01-12T16:57:00Z" w16du:dateUtc="2026-01-12T16:57:00Z">
+                  <w:rPrChange w:id="209" w:author="Alfred Anate Bodurin Mayaki" w:date="2026-01-12T16:57:00Z" w16du:dateUtc="2026-01-12T16:57:00Z">
                     <w:rPr>
                       <w:rStyle w:val="Hyperlink"/>
                       <w:rFonts w:ascii="CMU Sans Serif" w:hAnsi="CMU Sans Serif" w:cs="CMU Sans Serif"/>
@@ -8666,10 +8730,10 @@
                 <w:fldChar w:fldCharType="end"/>
               </w:r>
             </w:del>
-            <w:ins w:id="209" w:author="Alfred Anate Bodurin Mayaki" w:date="2026-01-12T16:57:00Z" w16du:dateUtc="2026-01-12T16:57:00Z">
+            <w:ins w:id="210" w:author="Alfred Anate Bodurin Mayaki" w:date="2026-01-12T16:57:00Z" w16du:dateUtc="2026-01-12T16:57:00Z">
               <w:r>
                 <w:rPr>
-                  <w:rPrChange w:id="210" w:author="Alfred Anate Bodurin Mayaki" w:date="2026-01-12T16:57:00Z" w16du:dateUtc="2026-01-12T16:57:00Z">
+                  <w:rPrChange w:id="211" w:author="Alfred Anate Bodurin Mayaki" w:date="2026-01-12T16:57:00Z" w16du:dateUtc="2026-01-12T16:57:00Z">
                     <w:rPr>
                       <w:rStyle w:val="Hyperlink"/>
                       <w:rFonts w:ascii="CMU Sans Serif" w:hAnsi="CMU Sans Serif" w:cs="CMU Sans Serif"/>
@@ -8698,7 +8762,7 @@
                 <w:szCs w:val="20"/>
               </w:rPr>
             </w:pPr>
-            <w:del w:id="211" w:author="Alfred Anate Bodurin Mayaki" w:date="2026-01-12T16:58:00Z" w16du:dateUtc="2026-01-12T16:58:00Z">
+            <w:del w:id="212" w:author="Alfred Anate Bodurin Mayaki" w:date="2026-01-12T16:58:00Z" w16du:dateUtc="2026-01-12T16:58:00Z">
               <w:r>
                 <w:fldChar w:fldCharType="begin"/>
               </w:r>
@@ -8710,7 +8774,7 @@
               </w:r>
               <w:r>
                 <w:rPr>
-                  <w:rPrChange w:id="212" w:author="Alfred Anate Bodurin Mayaki" w:date="2026-01-12T16:58:00Z" w16du:dateUtc="2026-01-12T16:58:00Z">
+                  <w:rPrChange w:id="213" w:author="Alfred Anate Bodurin Mayaki" w:date="2026-01-12T16:58:00Z" w16du:dateUtc="2026-01-12T16:58:00Z">
                     <w:rPr>
                       <w:rStyle w:val="Hyperlink"/>
                       <w:rFonts w:ascii="CMU Sans Serif" w:hAnsi="CMU Sans Serif" w:cs="CMU Sans Serif"/>
@@ -8725,10 +8789,10 @@
                 <w:fldChar w:fldCharType="end"/>
               </w:r>
             </w:del>
-            <w:ins w:id="213" w:author="Alfred Anate Bodurin Mayaki" w:date="2026-01-12T16:58:00Z" w16du:dateUtc="2026-01-12T16:58:00Z">
+            <w:ins w:id="214" w:author="Alfred Anate Bodurin Mayaki" w:date="2026-01-12T16:58:00Z" w16du:dateUtc="2026-01-12T16:58:00Z">
               <w:r>
                 <w:rPr>
-                  <w:rPrChange w:id="214" w:author="Alfred Anate Bodurin Mayaki" w:date="2026-01-12T16:58:00Z" w16du:dateUtc="2026-01-12T16:58:00Z">
+                  <w:rPrChange w:id="215" w:author="Alfred Anate Bodurin Mayaki" w:date="2026-01-12T16:58:00Z" w16du:dateUtc="2026-01-12T16:58:00Z">
                     <w:rPr>
                       <w:rStyle w:val="Hyperlink"/>
                       <w:rFonts w:ascii="CMU Sans Serif" w:hAnsi="CMU Sans Serif" w:cs="CMU Sans Serif"/>
@@ -8842,7 +8906,7 @@
                 <w:szCs w:val="20"/>
               </w:rPr>
             </w:pPr>
-            <w:del w:id="215" w:author="Alfred Anate Bodurin Mayaki" w:date="2026-01-12T16:57:00Z" w16du:dateUtc="2026-01-12T16:57:00Z">
+            <w:del w:id="216" w:author="Alfred Anate Bodurin Mayaki" w:date="2026-01-12T16:57:00Z" w16du:dateUtc="2026-01-12T16:57:00Z">
               <w:r>
                 <w:fldChar w:fldCharType="begin"/>
               </w:r>
@@ -8854,7 +8918,7 @@
               </w:r>
               <w:r>
                 <w:rPr>
-                  <w:rPrChange w:id="216" w:author="Alfred Anate Bodurin Mayaki" w:date="2026-01-12T16:57:00Z" w16du:dateUtc="2026-01-12T16:57:00Z">
+                  <w:rPrChange w:id="217" w:author="Alfred Anate Bodurin Mayaki" w:date="2026-01-12T16:57:00Z" w16du:dateUtc="2026-01-12T16:57:00Z">
                     <w:rPr>
                       <w:rStyle w:val="Hyperlink"/>
                       <w:rFonts w:ascii="CMU Sans Serif" w:hAnsi="CMU Sans Serif" w:cs="CMU Sans Serif"/>
@@ -8869,10 +8933,10 @@
                 <w:fldChar w:fldCharType="end"/>
               </w:r>
             </w:del>
-            <w:ins w:id="217" w:author="Alfred Anate Bodurin Mayaki" w:date="2026-01-12T16:57:00Z" w16du:dateUtc="2026-01-12T16:57:00Z">
+            <w:ins w:id="218" w:author="Alfred Anate Bodurin Mayaki" w:date="2026-01-12T16:57:00Z" w16du:dateUtc="2026-01-12T16:57:00Z">
               <w:r>
                 <w:rPr>
-                  <w:rPrChange w:id="218" w:author="Alfred Anate Bodurin Mayaki" w:date="2026-01-12T16:57:00Z" w16du:dateUtc="2026-01-12T16:57:00Z">
+                  <w:rPrChange w:id="219" w:author="Alfred Anate Bodurin Mayaki" w:date="2026-01-12T16:57:00Z" w16du:dateUtc="2026-01-12T16:57:00Z">
                     <w:rPr>
                       <w:rStyle w:val="Hyperlink"/>
                       <w:rFonts w:ascii="CMU Sans Serif" w:hAnsi="CMU Sans Serif" w:cs="CMU Sans Serif"/>
@@ -8901,7 +8965,7 @@
                 <w:szCs w:val="20"/>
               </w:rPr>
             </w:pPr>
-            <w:del w:id="219" w:author="Alfred Anate Bodurin Mayaki" w:date="2026-01-12T16:57:00Z" w16du:dateUtc="2026-01-12T16:57:00Z">
+            <w:del w:id="220" w:author="Alfred Anate Bodurin Mayaki" w:date="2026-01-12T16:57:00Z" w16du:dateUtc="2026-01-12T16:57:00Z">
               <w:r>
                 <w:fldChar w:fldCharType="begin"/>
               </w:r>
@@ -8913,7 +8977,7 @@
               </w:r>
               <w:r>
                 <w:rPr>
-                  <w:rPrChange w:id="220" w:author="Alfred Anate Bodurin Mayaki" w:date="2026-01-12T16:57:00Z" w16du:dateUtc="2026-01-12T16:57:00Z">
+                  <w:rPrChange w:id="221" w:author="Alfred Anate Bodurin Mayaki" w:date="2026-01-12T16:57:00Z" w16du:dateUtc="2026-01-12T16:57:00Z">
                     <w:rPr>
                       <w:rStyle w:val="Hyperlink"/>
                       <w:rFonts w:ascii="CMU Sans Serif" w:hAnsi="CMU Sans Serif" w:cs="CMU Sans Serif"/>
@@ -8928,10 +8992,10 @@
                 <w:fldChar w:fldCharType="end"/>
               </w:r>
             </w:del>
-            <w:ins w:id="221" w:author="Alfred Anate Bodurin Mayaki" w:date="2026-01-12T16:57:00Z" w16du:dateUtc="2026-01-12T16:57:00Z">
+            <w:ins w:id="222" w:author="Alfred Anate Bodurin Mayaki" w:date="2026-01-12T16:57:00Z" w16du:dateUtc="2026-01-12T16:57:00Z">
               <w:r>
                 <w:rPr>
-                  <w:rPrChange w:id="222" w:author="Alfred Anate Bodurin Mayaki" w:date="2026-01-12T16:57:00Z" w16du:dateUtc="2026-01-12T16:57:00Z">
+                  <w:rPrChange w:id="223" w:author="Alfred Anate Bodurin Mayaki" w:date="2026-01-12T16:57:00Z" w16du:dateUtc="2026-01-12T16:57:00Z">
                     <w:rPr>
                       <w:rStyle w:val="Hyperlink"/>
                       <w:rFonts w:ascii="CMU Sans Serif" w:hAnsi="CMU Sans Serif" w:cs="CMU Sans Serif"/>
@@ -8960,7 +9024,7 @@
                 <w:szCs w:val="20"/>
               </w:rPr>
             </w:pPr>
-            <w:del w:id="223" w:author="Alfred Anate Bodurin Mayaki" w:date="2026-01-12T16:58:00Z" w16du:dateUtc="2026-01-12T16:58:00Z">
+            <w:del w:id="224" w:author="Alfred Anate Bodurin Mayaki" w:date="2026-01-12T16:58:00Z" w16du:dateUtc="2026-01-12T16:58:00Z">
               <w:r>
                 <w:fldChar w:fldCharType="begin"/>
               </w:r>
@@ -8972,7 +9036,7 @@
               </w:r>
               <w:r>
                 <w:rPr>
-                  <w:rPrChange w:id="224" w:author="Alfred Anate Bodurin Mayaki" w:date="2026-01-12T16:58:00Z" w16du:dateUtc="2026-01-12T16:58:00Z">
+                  <w:rPrChange w:id="225" w:author="Alfred Anate Bodurin Mayaki" w:date="2026-01-12T16:58:00Z" w16du:dateUtc="2026-01-12T16:58:00Z">
                     <w:rPr>
                       <w:rStyle w:val="Hyperlink"/>
                       <w:rFonts w:ascii="CMU Sans Serif" w:hAnsi="CMU Sans Serif" w:cs="CMU Sans Serif"/>
@@ -8987,10 +9051,10 @@
                 <w:fldChar w:fldCharType="end"/>
               </w:r>
             </w:del>
-            <w:ins w:id="225" w:author="Alfred Anate Bodurin Mayaki" w:date="2026-01-12T16:58:00Z" w16du:dateUtc="2026-01-12T16:58:00Z">
+            <w:ins w:id="226" w:author="Alfred Anate Bodurin Mayaki" w:date="2026-01-12T16:58:00Z" w16du:dateUtc="2026-01-12T16:58:00Z">
               <w:r>
                 <w:rPr>
-                  <w:rPrChange w:id="226" w:author="Alfred Anate Bodurin Mayaki" w:date="2026-01-12T16:58:00Z" w16du:dateUtc="2026-01-12T16:58:00Z">
+                  <w:rPrChange w:id="227" w:author="Alfred Anate Bodurin Mayaki" w:date="2026-01-12T16:58:00Z" w16du:dateUtc="2026-01-12T16:58:00Z">
                     <w:rPr>
                       <w:rStyle w:val="Hyperlink"/>
                       <w:rFonts w:ascii="CMU Sans Serif" w:hAnsi="CMU Sans Serif" w:cs="CMU Sans Serif"/>
@@ -9104,7 +9168,7 @@
                 <w:szCs w:val="20"/>
               </w:rPr>
             </w:pPr>
-            <w:del w:id="227" w:author="Alfred Anate Bodurin Mayaki" w:date="2026-01-12T16:57:00Z" w16du:dateUtc="2026-01-12T16:57:00Z">
+            <w:del w:id="228" w:author="Alfred Anate Bodurin Mayaki" w:date="2026-01-12T16:57:00Z" w16du:dateUtc="2026-01-12T16:57:00Z">
               <w:r>
                 <w:fldChar w:fldCharType="begin"/>
               </w:r>
@@ -9116,7 +9180,7 @@
               </w:r>
               <w:r>
                 <w:rPr>
-                  <w:rPrChange w:id="228" w:author="Alfred Anate Bodurin Mayaki" w:date="2026-01-12T16:57:00Z" w16du:dateUtc="2026-01-12T16:57:00Z">
+                  <w:rPrChange w:id="229" w:author="Alfred Anate Bodurin Mayaki" w:date="2026-01-12T16:57:00Z" w16du:dateUtc="2026-01-12T16:57:00Z">
                     <w:rPr>
                       <w:rStyle w:val="Hyperlink"/>
                       <w:rFonts w:ascii="CMU Sans Serif" w:hAnsi="CMU Sans Serif" w:cs="CMU Sans Serif"/>
@@ -9131,10 +9195,10 @@
                 <w:fldChar w:fldCharType="end"/>
               </w:r>
             </w:del>
-            <w:ins w:id="229" w:author="Alfred Anate Bodurin Mayaki" w:date="2026-01-12T16:57:00Z" w16du:dateUtc="2026-01-12T16:57:00Z">
+            <w:ins w:id="230" w:author="Alfred Anate Bodurin Mayaki" w:date="2026-01-12T16:57:00Z" w16du:dateUtc="2026-01-12T16:57:00Z">
               <w:r>
                 <w:rPr>
-                  <w:rPrChange w:id="230" w:author="Alfred Anate Bodurin Mayaki" w:date="2026-01-12T16:57:00Z" w16du:dateUtc="2026-01-12T16:57:00Z">
+                  <w:rPrChange w:id="231" w:author="Alfred Anate Bodurin Mayaki" w:date="2026-01-12T16:57:00Z" w16du:dateUtc="2026-01-12T16:57:00Z">
                     <w:rPr>
                       <w:rStyle w:val="Hyperlink"/>
                       <w:rFonts w:ascii="CMU Sans Serif" w:hAnsi="CMU Sans Serif" w:cs="CMU Sans Serif"/>
@@ -9163,7 +9227,7 @@
                 <w:szCs w:val="20"/>
               </w:rPr>
             </w:pPr>
-            <w:del w:id="231" w:author="Alfred Anate Bodurin Mayaki" w:date="2026-01-12T16:57:00Z" w16du:dateUtc="2026-01-12T16:57:00Z">
+            <w:del w:id="232" w:author="Alfred Anate Bodurin Mayaki" w:date="2026-01-12T16:57:00Z" w16du:dateUtc="2026-01-12T16:57:00Z">
               <w:r>
                 <w:fldChar w:fldCharType="begin"/>
               </w:r>
@@ -9175,7 +9239,7 @@
               </w:r>
               <w:r>
                 <w:rPr>
-                  <w:rPrChange w:id="232" w:author="Alfred Anate Bodurin Mayaki" w:date="2026-01-12T16:57:00Z" w16du:dateUtc="2026-01-12T16:57:00Z">
+                  <w:rPrChange w:id="233" w:author="Alfred Anate Bodurin Mayaki" w:date="2026-01-12T16:57:00Z" w16du:dateUtc="2026-01-12T16:57:00Z">
                     <w:rPr>
                       <w:rStyle w:val="Hyperlink"/>
                       <w:rFonts w:ascii="CMU Sans Serif" w:hAnsi="CMU Sans Serif" w:cs="CMU Sans Serif"/>
@@ -9190,10 +9254,10 @@
                 <w:fldChar w:fldCharType="end"/>
               </w:r>
             </w:del>
-            <w:ins w:id="233" w:author="Alfred Anate Bodurin Mayaki" w:date="2026-01-12T16:57:00Z" w16du:dateUtc="2026-01-12T16:57:00Z">
+            <w:ins w:id="234" w:author="Alfred Anate Bodurin Mayaki" w:date="2026-01-12T16:57:00Z" w16du:dateUtc="2026-01-12T16:57:00Z">
               <w:r>
                 <w:rPr>
-                  <w:rPrChange w:id="234" w:author="Alfred Anate Bodurin Mayaki" w:date="2026-01-12T16:57:00Z" w16du:dateUtc="2026-01-12T16:57:00Z">
+                  <w:rPrChange w:id="235" w:author="Alfred Anate Bodurin Mayaki" w:date="2026-01-12T16:57:00Z" w16du:dateUtc="2026-01-12T16:57:00Z">
                     <w:rPr>
                       <w:rStyle w:val="Hyperlink"/>
                       <w:rFonts w:ascii="CMU Sans Serif" w:hAnsi="CMU Sans Serif" w:cs="CMU Sans Serif"/>
@@ -9222,7 +9286,7 @@
                 <w:szCs w:val="20"/>
               </w:rPr>
             </w:pPr>
-            <w:del w:id="235" w:author="Alfred Anate Bodurin Mayaki" w:date="2026-01-12T16:58:00Z" w16du:dateUtc="2026-01-12T16:58:00Z">
+            <w:del w:id="236" w:author="Alfred Anate Bodurin Mayaki" w:date="2026-01-12T16:58:00Z" w16du:dateUtc="2026-01-12T16:58:00Z">
               <w:r>
                 <w:fldChar w:fldCharType="begin"/>
               </w:r>
@@ -9234,7 +9298,7 @@
               </w:r>
               <w:r>
                 <w:rPr>
-                  <w:rPrChange w:id="236" w:author="Alfred Anate Bodurin Mayaki" w:date="2026-01-12T16:58:00Z" w16du:dateUtc="2026-01-12T16:58:00Z">
+                  <w:rPrChange w:id="237" w:author="Alfred Anate Bodurin Mayaki" w:date="2026-01-12T16:58:00Z" w16du:dateUtc="2026-01-12T16:58:00Z">
                     <w:rPr>
                       <w:rStyle w:val="Hyperlink"/>
                       <w:rFonts w:ascii="CMU Sans Serif" w:hAnsi="CMU Sans Serif" w:cs="CMU Sans Serif"/>
@@ -9249,10 +9313,10 @@
                 <w:fldChar w:fldCharType="end"/>
               </w:r>
             </w:del>
-            <w:ins w:id="237" w:author="Alfred Anate Bodurin Mayaki" w:date="2026-01-12T16:58:00Z" w16du:dateUtc="2026-01-12T16:58:00Z">
+            <w:ins w:id="238" w:author="Alfred Anate Bodurin Mayaki" w:date="2026-01-12T16:58:00Z" w16du:dateUtc="2026-01-12T16:58:00Z">
               <w:r>
                 <w:rPr>
-                  <w:rPrChange w:id="238" w:author="Alfred Anate Bodurin Mayaki" w:date="2026-01-12T16:58:00Z" w16du:dateUtc="2026-01-12T16:58:00Z">
+                  <w:rPrChange w:id="239" w:author="Alfred Anate Bodurin Mayaki" w:date="2026-01-12T16:58:00Z" w16du:dateUtc="2026-01-12T16:58:00Z">
                     <w:rPr>
                       <w:rStyle w:val="Hyperlink"/>
                       <w:rFonts w:ascii="CMU Sans Serif" w:hAnsi="CMU Sans Serif" w:cs="CMU Sans Serif"/>
@@ -9270,7 +9334,7 @@
       <w:tr>
         <w:tblPrEx>
           <w:tblW w:w="0" w:type="auto"/>
-          <w:tblPrExChange w:id="239" w:author="Alfred Anate Bodurin Mayaki" w:date="2026-01-12T16:56:00Z" w16du:dateUtc="2026-01-12T16:56:00Z">
+          <w:tblPrExChange w:id="240" w:author="Alfred Anate Bodurin Mayaki" w:date="2026-01-12T16:56:00Z" w16du:dateUtc="2026-01-12T16:56:00Z">
             <w:tblPrEx>
               <w:tblW w:w="0" w:type="auto"/>
             </w:tblPrEx>
@@ -9278,7 +9342,7 @@
         </w:tblPrEx>
         <w:trPr>
           <w:trHeight w:val="80"/>
-          <w:trPrChange w:id="240" w:author="Alfred Anate Bodurin Mayaki" w:date="2026-01-12T16:56:00Z" w16du:dateUtc="2026-01-12T16:56:00Z">
+          <w:trPrChange w:id="241" w:author="Alfred Anate Bodurin Mayaki" w:date="2026-01-12T16:56:00Z" w16du:dateUtc="2026-01-12T16:56:00Z">
             <w:trPr>
               <w:gridAfter w:val="0"/>
             </w:trPr>
@@ -9288,7 +9352,7 @@
           <w:tcPr>
             <w:cnfStyle w:val="001000000000" w:firstRow="0" w:lastRow="0" w:firstColumn="1" w:lastColumn="0" w:oddVBand="0" w:evenVBand="0" w:oddHBand="0" w:evenHBand="0" w:firstRowFirstColumn="0" w:firstRowLastColumn="0" w:lastRowFirstColumn="0" w:lastRowLastColumn="0"/>
             <w:tcW w:w="1838" w:type="dxa"/>
-            <w:tcPrChange w:id="241" w:author="Alfred Anate Bodurin Mayaki" w:date="2026-01-12T16:56:00Z" w16du:dateUtc="2026-01-12T16:56:00Z">
+            <w:tcPrChange w:id="242" w:author="Alfred Anate Bodurin Mayaki" w:date="2026-01-12T16:56:00Z" w16du:dateUtc="2026-01-12T16:56:00Z">
               <w:tcPr>
                 <w:tcW w:w="1838" w:type="dxa"/>
               </w:tcPr>
@@ -9318,7 +9382,7 @@
         <w:tc>
           <w:tcPr>
             <w:tcW w:w="4172" w:type="dxa"/>
-            <w:tcPrChange w:id="242" w:author="Alfred Anate Bodurin Mayaki" w:date="2026-01-12T16:56:00Z" w16du:dateUtc="2026-01-12T16:56:00Z">
+            <w:tcPrChange w:id="243" w:author="Alfred Anate Bodurin Mayaki" w:date="2026-01-12T16:56:00Z" w16du:dateUtc="2026-01-12T16:56:00Z">
               <w:tcPr>
                 <w:tcW w:w="4172" w:type="dxa"/>
                 <w:gridSpan w:val="2"/>
@@ -9350,7 +9414,7 @@
         <w:tc>
           <w:tcPr>
             <w:tcW w:w="3006" w:type="dxa"/>
-            <w:tcPrChange w:id="243" w:author="Alfred Anate Bodurin Mayaki" w:date="2026-01-12T16:56:00Z" w16du:dateUtc="2026-01-12T16:56:00Z">
+            <w:tcPrChange w:id="244" w:author="Alfred Anate Bodurin Mayaki" w:date="2026-01-12T16:56:00Z" w16du:dateUtc="2026-01-12T16:56:00Z">
               <w:tcPr>
                 <w:tcW w:w="3006" w:type="dxa"/>
                 <w:gridSpan w:val="2"/>
@@ -9427,7 +9491,7 @@
                 <w:szCs w:val="20"/>
               </w:rPr>
             </w:pPr>
-            <w:del w:id="244" w:author="Alfred Anate Bodurin Mayaki" w:date="2026-01-12T16:58:00Z" w16du:dateUtc="2026-01-12T16:58:00Z">
+            <w:del w:id="245" w:author="Alfred Anate Bodurin Mayaki" w:date="2026-01-12T16:58:00Z" w16du:dateUtc="2026-01-12T16:58:00Z">
               <w:r>
                 <w:fldChar w:fldCharType="begin"/>
               </w:r>
@@ -9439,7 +9503,7 @@
               </w:r>
               <w:r>
                 <w:rPr>
-                  <w:rPrChange w:id="245" w:author="Alfred Anate Bodurin Mayaki" w:date="2026-01-12T16:58:00Z" w16du:dateUtc="2026-01-12T16:58:00Z">
+                  <w:rPrChange w:id="246" w:author="Alfred Anate Bodurin Mayaki" w:date="2026-01-12T16:58:00Z" w16du:dateUtc="2026-01-12T16:58:00Z">
                     <w:rPr>
                       <w:rStyle w:val="Hyperlink"/>
                       <w:rFonts w:ascii="CMU Sans Serif" w:hAnsi="CMU Sans Serif" w:cs="CMU Sans Serif"/>
@@ -9454,10 +9518,10 @@
                 <w:fldChar w:fldCharType="end"/>
               </w:r>
             </w:del>
-            <w:ins w:id="246" w:author="Alfred Anate Bodurin Mayaki" w:date="2026-01-12T16:58:00Z" w16du:dateUtc="2026-01-12T16:58:00Z">
+            <w:ins w:id="247" w:author="Alfred Anate Bodurin Mayaki" w:date="2026-01-12T16:58:00Z" w16du:dateUtc="2026-01-12T16:58:00Z">
               <w:r>
                 <w:rPr>
-                  <w:rPrChange w:id="247" w:author="Alfred Anate Bodurin Mayaki" w:date="2026-01-12T16:58:00Z" w16du:dateUtc="2026-01-12T16:58:00Z">
+                  <w:rPrChange w:id="248" w:author="Alfred Anate Bodurin Mayaki" w:date="2026-01-12T16:58:00Z" w16du:dateUtc="2026-01-12T16:58:00Z">
                     <w:rPr>
                       <w:rStyle w:val="Hyperlink"/>
                       <w:rFonts w:ascii="CMU Sans Serif" w:hAnsi="CMU Sans Serif" w:cs="CMU Sans Serif"/>
@@ -9486,7 +9550,7 @@
                 <w:szCs w:val="20"/>
               </w:rPr>
             </w:pPr>
-            <w:del w:id="248" w:author="Alfred Anate Bodurin Mayaki" w:date="2026-01-12T16:58:00Z" w16du:dateUtc="2026-01-12T16:58:00Z">
+            <w:del w:id="249" w:author="Alfred Anate Bodurin Mayaki" w:date="2026-01-12T16:58:00Z" w16du:dateUtc="2026-01-12T16:58:00Z">
               <w:r>
                 <w:fldChar w:fldCharType="begin"/>
               </w:r>
@@ -9498,7 +9562,7 @@
               </w:r>
               <w:r>
                 <w:rPr>
-                  <w:rPrChange w:id="249" w:author="Alfred Anate Bodurin Mayaki" w:date="2026-01-12T16:58:00Z" w16du:dateUtc="2026-01-12T16:58:00Z">
+                  <w:rPrChange w:id="250" w:author="Alfred Anate Bodurin Mayaki" w:date="2026-01-12T16:58:00Z" w16du:dateUtc="2026-01-12T16:58:00Z">
                     <w:rPr>
                       <w:rStyle w:val="Hyperlink"/>
                       <w:rFonts w:ascii="CMU Sans Serif" w:hAnsi="CMU Sans Serif" w:cs="CMU Sans Serif"/>
@@ -9513,10 +9577,10 @@
                 <w:fldChar w:fldCharType="end"/>
               </w:r>
             </w:del>
-            <w:ins w:id="250" w:author="Alfred Anate Bodurin Mayaki" w:date="2026-01-12T16:58:00Z" w16du:dateUtc="2026-01-12T16:58:00Z">
+            <w:ins w:id="251" w:author="Alfred Anate Bodurin Mayaki" w:date="2026-01-12T16:58:00Z" w16du:dateUtc="2026-01-12T16:58:00Z">
               <w:r>
                 <w:rPr>
-                  <w:rPrChange w:id="251" w:author="Alfred Anate Bodurin Mayaki" w:date="2026-01-12T16:58:00Z" w16du:dateUtc="2026-01-12T16:58:00Z">
+                  <w:rPrChange w:id="252" w:author="Alfred Anate Bodurin Mayaki" w:date="2026-01-12T16:58:00Z" w16du:dateUtc="2026-01-12T16:58:00Z">
                     <w:rPr>
                       <w:rStyle w:val="Hyperlink"/>
                       <w:rFonts w:ascii="CMU Sans Serif" w:hAnsi="CMU Sans Serif" w:cs="CMU Sans Serif"/>
@@ -9638,7 +9702,7 @@
         <w:contextualSpacing/>
         <w:jc w:val="both"/>
         <w:rPr>
-          <w:ins w:id="252" w:author="Alfred Anate Bodurin Mayaki" w:date="2026-01-12T17:01:00Z" w16du:dateUtc="2026-01-12T17:01:00Z"/>
+          <w:ins w:id="253" w:author="Alfred Anate Bodurin Mayaki" w:date="2026-01-12T17:01:00Z" w16du:dateUtc="2026-01-12T17:01:00Z"/>
           <w:rStyle w:val="Strong"/>
           <w:rFonts w:ascii="CMU Sans Serif" w:hAnsi="CMU Sans Serif" w:cs="CMU Sans Serif"/>
           <w:b w:val="0"/>
@@ -9646,7 +9710,7 @@
           <w:color w:val="000000" w:themeColor="text1"/>
         </w:rPr>
       </w:pPr>
-      <w:bookmarkStart w:id="253" w:name="_Toc216632810"/>
+      <w:bookmarkStart w:id="254" w:name="_Toc216632810"/>
     </w:p>
     <w:p>
       <w:pPr>
@@ -9661,7 +9725,7 @@
           <w:color w:val="000000" w:themeColor="text1"/>
         </w:rPr>
       </w:pPr>
-      <w:bookmarkStart w:id="254" w:name="_Toc219130666"/>
+      <w:bookmarkStart w:id="255" w:name="_Toc219130666"/>
       <w:r>
         <w:rPr>
           <w:rStyle w:val="Strong"/>
@@ -9682,7 +9746,7 @@
         </w:rPr>
         <w:t>Explicating my Literature Review 2</w:t>
       </w:r>
-      <w:bookmarkEnd w:id="253"/>
+      <w:bookmarkEnd w:id="254"/>
       <w:r>
         <w:rPr>
           <w:rStyle w:val="Strong"/>
@@ -9693,7 +9757,7 @@
         </w:rPr>
         <w:t xml:space="preserve"> – Signalling Theory</w:t>
       </w:r>
-      <w:bookmarkEnd w:id="254"/>
+      <w:bookmarkEnd w:id="255"/>
     </w:p>
     <w:p>
       <w:pPr>
@@ -11063,7 +11127,7 @@
           <w:color w:val="000000" w:themeColor="text1"/>
         </w:rPr>
       </w:pPr>
-      <w:bookmarkStart w:id="255" w:name="_Toc219130667"/>
+      <w:bookmarkStart w:id="256" w:name="_Toc219130667"/>
       <w:r>
         <w:rPr>
           <w:rStyle w:val="Strong"/>
@@ -11094,7 +11158,7 @@
         </w:rPr>
         <w:t>3 – Recruitment &amp; Selection</w:t>
       </w:r>
-      <w:bookmarkEnd w:id="255"/>
+      <w:bookmarkEnd w:id="256"/>
     </w:p>
     <w:p>
       <w:pPr>
@@ -11149,7 +11213,7 @@
         </w:numPr>
         <w:jc w:val="both"/>
         <w:rPr>
-          <w:del w:id="256" w:author="Alfred Anate Bodurin Mayaki" w:date="2026-01-12T17:02:00Z" w16du:dateUtc="2026-01-12T17:02:00Z"/>
+          <w:del w:id="257" w:author="Alfred Anate Bodurin Mayaki" w:date="2026-01-12T17:02:00Z" w16du:dateUtc="2026-01-12T17:02:00Z"/>
           <w:rFonts w:ascii="CMU Sans Serif" w:hAnsi="CMU Sans Serif" w:cs="CMU Sans Serif"/>
           <w:sz w:val="20"/>
           <w:szCs w:val="20"/>
@@ -11181,7 +11245,7 @@
         </w:numPr>
         <w:jc w:val="both"/>
         <w:rPr>
-          <w:ins w:id="257" w:author="Alfred Anate Bodurin Mayaki" w:date="2026-01-12T17:02:00Z" w16du:dateUtc="2026-01-12T17:02:00Z"/>
+          <w:ins w:id="258" w:author="Alfred Anate Bodurin Mayaki" w:date="2026-01-12T17:02:00Z" w16du:dateUtc="2026-01-12T17:02:00Z"/>
           <w:rFonts w:ascii="CMU Sans Serif" w:hAnsi="CMU Sans Serif" w:cs="CMU Sans Serif"/>
           <w:sz w:val="20"/>
           <w:szCs w:val="20"/>
@@ -11200,11 +11264,11 @@
           <w:rFonts w:ascii="CMU Sans Serif" w:hAnsi="CMU Sans Serif" w:cs="CMU Sans Serif"/>
           <w:sz w:val="20"/>
           <w:szCs w:val="20"/>
-          <w:rPrChange w:id="258" w:author="Alfred Anate Bodurin Mayaki" w:date="2026-01-12T17:02:00Z" w16du:dateUtc="2026-01-12T17:02:00Z">
+          <w:rPrChange w:id="259" w:author="Alfred Anate Bodurin Mayaki" w:date="2026-01-12T17:02:00Z" w16du:dateUtc="2026-01-12T17:02:00Z">
             <w:rPr/>
           </w:rPrChange>
         </w:rPr>
-        <w:pPrChange w:id="259" w:author="Alfred Anate Bodurin Mayaki" w:date="2026-01-12T17:02:00Z" w16du:dateUtc="2026-01-12T17:02:00Z">
+        <w:pPrChange w:id="260" w:author="Alfred Anate Bodurin Mayaki" w:date="2026-01-12T17:02:00Z" w16du:dateUtc="2026-01-12T17:02:00Z">
           <w:pPr>
             <w:pStyle w:val="ListParagraph"/>
             <w:numPr>
@@ -11215,7 +11279,7 @@
           </w:pPr>
         </w:pPrChange>
       </w:pPr>
-      <w:ins w:id="260" w:author="Alfred Anate Bodurin Mayaki" w:date="2026-01-12T17:02:00Z" w16du:dateUtc="2026-01-12T17:02:00Z">
+      <w:ins w:id="261" w:author="Alfred Anate Bodurin Mayaki" w:date="2026-01-12T17:02:00Z" w16du:dateUtc="2026-01-12T17:02:00Z">
         <w:r>
           <w:rPr>
             <w:rFonts w:ascii="CMU Sans Serif" w:hAnsi="CMU Sans Serif" w:cs="CMU Sans Serif"/>
@@ -11239,7 +11303,7 @@
           <w:color w:val="000000" w:themeColor="text1"/>
         </w:rPr>
       </w:pPr>
-      <w:bookmarkStart w:id="261" w:name="_Toc219130668"/>
+      <w:bookmarkStart w:id="262" w:name="_Toc219130668"/>
       <w:r>
         <w:rPr>
           <w:rStyle w:val="Strong"/>
@@ -11250,7 +11314,7 @@
         </w:rPr>
         <w:t>11 Journal of Economic Literature (JEL) Classification</w:t>
       </w:r>
-      <w:bookmarkEnd w:id="261"/>
+      <w:bookmarkEnd w:id="262"/>
     </w:p>
     <w:p>
       <w:pPr>
@@ -12222,7 +12286,7 @@
       <w:pPr>
         <w:jc w:val="center"/>
         <w:rPr>
-          <w:del w:id="262" w:author="Alfred Anate Bodurin Mayaki" w:date="2026-01-12T16:59:00Z" w16du:dateUtc="2026-01-12T16:59:00Z"/>
+          <w:del w:id="263" w:author="Alfred Anate Bodurin Mayaki" w:date="2026-01-12T16:59:00Z" w16du:dateUtc="2026-01-12T16:59:00Z"/>
           <w:rFonts w:ascii="CMU Sans Serif" w:hAnsi="CMU Sans Serif" w:cs="CMU Sans Serif"/>
           <w:color w:val="000000" w:themeColor="text1"/>
           <w:sz w:val="20"/>
@@ -12240,7 +12304,7 @@
       </w:r>
       <w:r>
         <w:rPr>
-          <w:rPrChange w:id="263" w:author="Alfred Anate Bodurin Mayaki" w:date="2026-01-12T16:59:00Z" w16du:dateUtc="2026-01-12T16:59:00Z">
+          <w:rPrChange w:id="264" w:author="Alfred Anate Bodurin Mayaki" w:date="2026-01-12T16:59:00Z" w16du:dateUtc="2026-01-12T16:59:00Z">
             <w:rPr>
               <w:rStyle w:val="Hyperlink"/>
               <w:rFonts w:ascii="CMU Sans Serif" w:hAnsi="CMU Sans Serif" w:cs="CMU Sans Serif"/>
@@ -12256,7 +12320,7 @@
       <w:pPr>
         <w:jc w:val="center"/>
         <w:rPr>
-          <w:del w:id="264" w:author="Alfred Anate Bodurin Mayaki" w:date="2026-01-12T16:59:00Z" w16du:dateUtc="2026-01-12T16:59:00Z"/>
+          <w:del w:id="265" w:author="Alfred Anate Bodurin Mayaki" w:date="2026-01-12T16:59:00Z" w16du:dateUtc="2026-01-12T16:59:00Z"/>
           <w:rFonts w:ascii="CMU Sans Serif" w:hAnsi="CMU Sans Serif" w:cs="CMU Sans Serif"/>
           <w:color w:val="000000" w:themeColor="text1"/>
           <w:sz w:val="20"/>
@@ -12268,13 +12332,13 @@
       <w:pPr>
         <w:jc w:val="center"/>
         <w:rPr>
-          <w:ins w:id="265" w:author="Alfred Anate Bodurin Mayaki" w:date="2026-01-12T16:59:00Z" w16du:dateUtc="2026-01-12T16:59:00Z"/>
-          <w:rFonts w:ascii="CMU Sans Serif" w:hAnsi="CMU Sans Serif" w:cs="CMU Sans Serif"/>
-          <w:color w:val="000000" w:themeColor="text1"/>
-          <w:sz w:val="20"/>
-          <w:szCs w:val="20"/>
-        </w:rPr>
-        <w:pPrChange w:id="266" w:author="Alfred Anate Bodurin Mayaki" w:date="2026-01-12T16:59:00Z" w16du:dateUtc="2026-01-12T16:59:00Z">
+          <w:ins w:id="266" w:author="Alfred Anate Bodurin Mayaki" w:date="2026-01-12T16:59:00Z" w16du:dateUtc="2026-01-12T16:59:00Z"/>
+          <w:rFonts w:ascii="CMU Sans Serif" w:hAnsi="CMU Sans Serif" w:cs="CMU Sans Serif"/>
+          <w:color w:val="000000" w:themeColor="text1"/>
+          <w:sz w:val="20"/>
+          <w:szCs w:val="20"/>
+        </w:rPr>
+        <w:pPrChange w:id="267" w:author="Alfred Anate Bodurin Mayaki" w:date="2026-01-12T16:59:00Z" w16du:dateUtc="2026-01-12T16:59:00Z">
           <w:pPr>
             <w:jc w:val="both"/>
           </w:pPr>
@@ -12285,31 +12349,19 @@
       <w:pPr>
         <w:jc w:val="center"/>
         <w:rPr>
-          <w:del w:id="267" w:author="Alfred Anate Bodurin Mayaki" w:date="2026-01-12T16:59:00Z" w16du:dateUtc="2026-01-12T16:59:00Z"/>
-          <w:rFonts w:ascii="CMU Sans Serif" w:hAnsi="CMU Sans Serif" w:cs="CMU Sans Serif"/>
-          <w:color w:val="000000" w:themeColor="text1"/>
-          <w:sz w:val="20"/>
-          <w:szCs w:val="20"/>
-        </w:rPr>
-      </w:pPr>
-    </w:p>
-    <w:p>
-      <w:pPr>
-        <w:jc w:val="both"/>
-        <w:rPr>
-          <w:ins w:id="268" w:author="Alfred Anate Bodurin Mayaki" w:date="2026-01-12T17:01:00Z" w16du:dateUtc="2026-01-12T17:01:00Z"/>
-          <w:rFonts w:ascii="CMU Sans Serif" w:hAnsi="CMU Sans Serif" w:cs="CMU Sans Serif"/>
-          <w:color w:val="000000" w:themeColor="text1"/>
-          <w:sz w:val="20"/>
-          <w:szCs w:val="20"/>
-        </w:rPr>
-      </w:pPr>
-    </w:p>
-    <w:p>
-      <w:pPr>
-        <w:jc w:val="both"/>
-        <w:rPr>
-          <w:ins w:id="269" w:author="Alfred Anate Bodurin Mayaki" w:date="2026-01-12T17:02:00Z" w16du:dateUtc="2026-01-12T17:02:00Z"/>
+          <w:del w:id="268" w:author="Alfred Anate Bodurin Mayaki" w:date="2026-01-12T16:59:00Z" w16du:dateUtc="2026-01-12T16:59:00Z"/>
+          <w:rFonts w:ascii="CMU Sans Serif" w:hAnsi="CMU Sans Serif" w:cs="CMU Sans Serif"/>
+          <w:color w:val="000000" w:themeColor="text1"/>
+          <w:sz w:val="20"/>
+          <w:szCs w:val="20"/>
+        </w:rPr>
+      </w:pPr>
+    </w:p>
+    <w:p>
+      <w:pPr>
+        <w:jc w:val="both"/>
+        <w:rPr>
+          <w:ins w:id="269" w:author="Alfred Anate Bodurin Mayaki" w:date="2026-01-12T17:01:00Z" w16du:dateUtc="2026-01-12T17:01:00Z"/>
           <w:rFonts w:ascii="CMU Sans Serif" w:hAnsi="CMU Sans Serif" w:cs="CMU Sans Serif"/>
           <w:color w:val="000000" w:themeColor="text1"/>
           <w:sz w:val="20"/>
@@ -12369,19 +12421,19 @@
       <w:pPr>
         <w:jc w:val="both"/>
         <w:rPr>
-          <w:ins w:id="274" w:author="Alfred Anate Bodurin Mayaki" w:date="2026-01-12T17:01:00Z" w16du:dateUtc="2026-01-12T17:01:00Z"/>
-          <w:rFonts w:ascii="CMU Sans Serif" w:hAnsi="CMU Sans Serif" w:cs="CMU Sans Serif"/>
-          <w:color w:val="000000" w:themeColor="text1"/>
-          <w:sz w:val="20"/>
-          <w:szCs w:val="20"/>
-        </w:rPr>
-      </w:pPr>
-    </w:p>
-    <w:p>
-      <w:pPr>
-        <w:jc w:val="both"/>
-        <w:rPr>
-          <w:del w:id="275" w:author="Alfred Anate Bodurin Mayaki" w:date="2026-01-12T16:59:00Z" w16du:dateUtc="2026-01-12T16:59:00Z"/>
+          <w:ins w:id="274" w:author="Alfred Anate Bodurin Mayaki" w:date="2026-01-12T17:02:00Z" w16du:dateUtc="2026-01-12T17:02:00Z"/>
+          <w:rFonts w:ascii="CMU Sans Serif" w:hAnsi="CMU Sans Serif" w:cs="CMU Sans Serif"/>
+          <w:color w:val="000000" w:themeColor="text1"/>
+          <w:sz w:val="20"/>
+          <w:szCs w:val="20"/>
+        </w:rPr>
+      </w:pPr>
+    </w:p>
+    <w:p>
+      <w:pPr>
+        <w:jc w:val="both"/>
+        <w:rPr>
+          <w:ins w:id="275" w:author="Alfred Anate Bodurin Mayaki" w:date="2026-01-12T17:01:00Z" w16du:dateUtc="2026-01-12T17:01:00Z"/>
           <w:rFonts w:ascii="CMU Sans Serif" w:hAnsi="CMU Sans Serif" w:cs="CMU Sans Serif"/>
           <w:color w:val="000000" w:themeColor="text1"/>
           <w:sz w:val="20"/>
@@ -12547,8 +12599,20 @@
     </w:p>
     <w:p>
       <w:pPr>
+        <w:jc w:val="both"/>
+        <w:rPr>
+          <w:del w:id="289" w:author="Alfred Anate Bodurin Mayaki" w:date="2026-01-12T16:59:00Z" w16du:dateUtc="2026-01-12T16:59:00Z"/>
+          <w:rFonts w:ascii="CMU Sans Serif" w:hAnsi="CMU Sans Serif" w:cs="CMU Sans Serif"/>
+          <w:color w:val="000000" w:themeColor="text1"/>
+          <w:sz w:val="20"/>
+          <w:szCs w:val="20"/>
+        </w:rPr>
+      </w:pPr>
+    </w:p>
+    <w:p>
+      <w:pPr>
         <w:jc w:val="center"/>
-        <w:pPrChange w:id="289" w:author="Alfred Anate Bodurin Mayaki" w:date="2026-01-12T16:59:00Z" w16du:dateUtc="2026-01-12T16:59:00Z">
+        <w:pPrChange w:id="290" w:author="Alfred Anate Bodurin Mayaki" w:date="2026-01-12T16:59:00Z" w16du:dateUtc="2026-01-12T16:59:00Z">
           <w:pPr>
             <w:pStyle w:val="Heading2"/>
             <w:contextualSpacing/>
@@ -12559,7 +12623,7 @@
       <w:r>
         <w:t>References</w:t>
       </w:r>
-      <w:bookmarkEnd w:id="132"/>
+      <w:bookmarkEnd w:id="133"/>
     </w:p>
     <w:p>
       <w:pPr>
@@ -12972,7 +13036,25 @@
           <w:sz w:val="20"/>
           <w:szCs w:val="20"/>
         </w:rPr>
-        <w:t>Dutta D, Adsule R (2025;) "Machines/humans agentic impacts on recruitment and selection practices across organizational contexts". </w:t>
+        <w:t>Dutta D, </w:t>
+      </w:r>
+      <w:proofErr w:type="spellStart"/>
+      <w:r>
+        <w:rPr>
+          <w:rFonts w:ascii="CMU Sans Serif" w:hAnsi="CMU Sans Serif" w:cs="CMU Sans Serif"/>
+          <w:sz w:val="20"/>
+          <w:szCs w:val="20"/>
+        </w:rPr>
+        <w:t>Adsule</w:t>
+      </w:r>
+      <w:proofErr w:type="spellEnd"/>
+      <w:r>
+        <w:rPr>
+          <w:rFonts w:ascii="CMU Sans Serif" w:hAnsi="CMU Sans Serif" w:cs="CMU Sans Serif"/>
+          <w:sz w:val="20"/>
+          <w:szCs w:val="20"/>
+        </w:rPr>
+        <w:t xml:space="preserve"> R (2025;) "Machines/humans agentic impacts on recruitment and selection practices across organizational contexts". </w:t>
       </w:r>
       <w:r>
         <w:rPr>
@@ -13205,7 +13287,25 @@
           <w:sz w:val="20"/>
           <w:szCs w:val="20"/>
         </w:rPr>
-        <w:t>Jones, D.A., Willness, C.R. and Madey, S. (2014) ‘Why Are Job Seekers Attracted by Corporate Social Performance? Experimental and Field Tests of Three Signal-Based Mechanisms’, </w:t>
+        <w:t xml:space="preserve">Jones, D.A., </w:t>
+      </w:r>
+      <w:proofErr w:type="spellStart"/>
+      <w:r>
+        <w:rPr>
+          <w:rFonts w:ascii="CMU Sans Serif" w:hAnsi="CMU Sans Serif" w:cs="CMU Sans Serif"/>
+          <w:sz w:val="20"/>
+          <w:szCs w:val="20"/>
+        </w:rPr>
+        <w:t>Willness</w:t>
+      </w:r>
+      <w:proofErr w:type="spellEnd"/>
+      <w:r>
+        <w:rPr>
+          <w:rFonts w:ascii="CMU Sans Serif" w:hAnsi="CMU Sans Serif" w:cs="CMU Sans Serif"/>
+          <w:sz w:val="20"/>
+          <w:szCs w:val="20"/>
+        </w:rPr>
+        <w:t>, C.R. and Madey, S. (2014) ‘Why Are Job Seekers Attracted by Corporate Social Performance? Experimental and Field Tests of Three Signal-Based Mechanisms’, </w:t>
       </w:r>
       <w:r>
         <w:rPr>
@@ -13266,7 +13366,25 @@
           <w:szCs w:val="20"/>
         </w:rPr>
         <w:lastRenderedPageBreak/>
-        <w:t xml:space="preserve">Khan, M. H., Grabarski, M. K., Ali, M., &amp; Buckmaster, S. (2023). Insights into Creating and Managing an Inclusive Neurodiverse Workplace for Positive Outcomes: A Multistage Theoretical Framework. </w:t>
+        <w:t xml:space="preserve">Khan, M. H., </w:t>
+      </w:r>
+      <w:proofErr w:type="spellStart"/>
+      <w:r>
+        <w:rPr>
+          <w:rFonts w:ascii="CMU Sans Serif" w:hAnsi="CMU Sans Serif" w:cs="CMU Sans Serif"/>
+          <w:sz w:val="20"/>
+          <w:szCs w:val="20"/>
+        </w:rPr>
+        <w:t>Grabarski</w:t>
+      </w:r>
+      <w:proofErr w:type="spellEnd"/>
+      <w:r>
+        <w:rPr>
+          <w:rFonts w:ascii="CMU Sans Serif" w:hAnsi="CMU Sans Serif" w:cs="CMU Sans Serif"/>
+          <w:sz w:val="20"/>
+          <w:szCs w:val="20"/>
+        </w:rPr>
+        <w:t xml:space="preserve">, M. K., Ali, M., &amp; Buckmaster, S. (2023). Insights into Creating and Managing an Inclusive Neurodiverse Workplace for Positive Outcomes: A Multistage Theoretical Framework. </w:t>
       </w:r>
       <w:r>
         <w:rPr>
@@ -13399,13 +13517,23 @@
           <w:szCs w:val="20"/>
         </w:rPr>
       </w:pPr>
-      <w:r>
-        <w:rPr>
-          <w:rFonts w:ascii="CMU Sans Serif" w:hAnsi="CMU Sans Serif" w:cs="CMU Sans Serif"/>
-          <w:sz w:val="20"/>
-          <w:szCs w:val="20"/>
-        </w:rPr>
-        <w:t>Lup, D. and Canonico, E. (2024) ‘Bridges and gatekeepers: Employees' willingness to refer qualified candidates on the autism spectrum’, </w:t>
+      <w:proofErr w:type="spellStart"/>
+      <w:r>
+        <w:rPr>
+          <w:rFonts w:ascii="CMU Sans Serif" w:hAnsi="CMU Sans Serif" w:cs="CMU Sans Serif"/>
+          <w:sz w:val="20"/>
+          <w:szCs w:val="20"/>
+        </w:rPr>
+        <w:t>Lup</w:t>
+      </w:r>
+      <w:proofErr w:type="spellEnd"/>
+      <w:r>
+        <w:rPr>
+          <w:rFonts w:ascii="CMU Sans Serif" w:hAnsi="CMU Sans Serif" w:cs="CMU Sans Serif"/>
+          <w:sz w:val="20"/>
+          <w:szCs w:val="20"/>
+        </w:rPr>
+        <w:t>, D. and Canonico, E. (2024) ‘Bridges and gatekeepers: Employees' willingness to refer qualified candidates on the autism spectrum’, </w:t>
       </w:r>
       <w:r>
         <w:rPr>
@@ -14026,7 +14154,7 @@
 
 <file path=word/comments.xml><?xml version="1.0" encoding="utf-8"?>
 <w:comments xmlns:wpc="http://schemas.microsoft.com/office/word/2010/wordprocessingCanvas" xmlns:cx="http://schemas.microsoft.com/office/drawing/2014/chartex" xmlns:cx1="http://schemas.microsoft.com/office/drawing/2015/9/8/chartex" xmlns:cx2="http://schemas.microsoft.com/office/drawing/2015/10/21/chartex" xmlns:cx3="http://schemas.microsoft.com/office/drawing/2016/5/9/chartex" xmlns:cx4="http://schemas.microsoft.com/office/drawing/2016/5/10/chartex" xmlns:cx5="http://schemas.microsoft.com/office/drawing/2016/5/11/chartex" xmlns:cx6="http://schemas.microsoft.com/office/drawing/2016/5/12/chartex" xmlns:cx7="http://schemas.microsoft.com/office/drawing/2016/5/13/chartex" xmlns:cx8="http://schemas.microsoft.com/office/drawing/2016/5/14/chartex" xmlns:mc="http://schemas.openxmlformats.org/markup-compatibility/2006" xmlns:aink="http://schemas.microsoft.com/office/drawing/2016/ink" xmlns:am3d="http://schemas.microsoft.com/office/drawing/2017/model3d" xmlns:o="urn:schemas-microsoft-com:office:office" xmlns:oel="http://schemas.microsoft.com/office/2019/extlst" xmlns:r="http://schemas.openxmlformats.org/officeDocument/2006/relationships" xmlns:m="http://schemas.openxmlformats.org/officeDocument/2006/math" xmlns:v="urn:schemas-microsoft-com:vml" xmlns:wp14="http://schemas.microsoft.com/office/word/2010/wordprocessingDrawing" xmlns:wp="http://schemas.openxmlformats.org/drawingml/2006/wordprocessingDrawing" xmlns:w10="urn:schemas-microsoft-com:office:word" xmlns:w="http://schemas.openxmlformats.org/wordprocessingml/2006/main" xmlns:w14="http://schemas.microsoft.com/office/word/2010/wordml" xmlns:w15="http://schemas.microsoft.com/office/word/2012/wordml" xmlns:w16cex="http://schemas.microsoft.com/office/word/2018/wordml/cex" xmlns:w16cid="http://schemas.microsoft.com/office/word/2016/wordml/cid" xmlns:w16="http://schemas.microsoft.com/office/word/2018/wordml" xmlns:w16du="http://schemas.microsoft.com/office/word/2023/wordml/word16du" xmlns:w16sdtdh="http://schemas.microsoft.com/office/word/2020/wordml/sdtdatahash" xmlns:w16sdtfl="http://schemas.microsoft.com/office/word/2024/wordml/sdtformatlock" xmlns:w16se="http://schemas.microsoft.com/office/word/2015/wordml/symex" xmlns:wpg="http://schemas.microsoft.com/office/word/2010/wordprocessingGroup" xmlns:wpi="http://schemas.microsoft.com/office/word/2010/wordprocessingInk" xmlns:wne="http://schemas.microsoft.com/office/word/2006/wordml" xmlns:wps="http://schemas.microsoft.com/office/word/2010/wordprocessingShape" mc:Ignorable="w14 w15 w16se w16cid w16 w16cex w16sdtdh w16sdtfl w16du wp14">
-  <w:comment w:id="113" w:author="Dr Nicola J Bowman" w:date="2025-12-08T12:42:00Z" w:initials="NB">
+  <w:comment w:id="114" w:author="Dr Nicola J Bowman" w:date="2025-12-08T12:42:00Z" w:initials="NB">
     <w:p>
       <w:pPr>
         <w:pStyle w:val="CommentText"/>
@@ -14042,7 +14170,7 @@
       </w:r>
     </w:p>
   </w:comment>
-  <w:comment w:id="114" w:author="Alfred Anate Bodurin Mayaki" w:date="2025-12-23T14:14:00Z" w:initials="AABM">
+  <w:comment w:id="115" w:author="Alfred Anate Bodurin Mayaki" w:date="2025-12-23T14:14:00Z" w:initials="AABM">
     <w:p>
       <w:pPr>
         <w:pStyle w:val="CommentText"/>
@@ -14058,7 +14186,7 @@
       </w:r>
     </w:p>
   </w:comment>
-  <w:comment w:id="115" w:author="Dr Nicola J Bowman" w:date="2025-12-08T12:43:00Z" w:initials="NB">
+  <w:comment w:id="116" w:author="Dr Nicola J Bowman" w:date="2025-12-08T12:43:00Z" w:initials="NB">
     <w:p>
       <w:pPr>
         <w:pStyle w:val="CommentText"/>
@@ -14074,7 +14202,7 @@
       </w:r>
     </w:p>
   </w:comment>
-  <w:comment w:id="117" w:author="Dr Nicola J Bowman" w:date="2025-12-08T12:44:00Z" w:initials="NB">
+  <w:comment w:id="118" w:author="Dr Nicola J Bowman" w:date="2025-12-08T12:44:00Z" w:initials="NB">
     <w:p>
       <w:pPr>
         <w:pStyle w:val="CommentText"/>
@@ -14090,7 +14218,7 @@
       </w:r>
     </w:p>
   </w:comment>
-  <w:comment w:id="118" w:author="Dr Nicola J Bowman" w:date="2025-12-08T12:47:00Z" w:initials="NB">
+  <w:comment w:id="119" w:author="Dr Nicola J Bowman" w:date="2025-12-08T12:47:00Z" w:initials="NB">
     <w:p>
       <w:pPr>
         <w:pStyle w:val="CommentText"/>
@@ -14106,7 +14234,7 @@
       </w:r>
     </w:p>
   </w:comment>
-  <w:comment w:id="119" w:author="Alfred Anate Bodurin Mayaki" w:date="2025-12-10T08:21:00Z" w:initials="AABM">
+  <w:comment w:id="120" w:author="Alfred Anate Bodurin Mayaki" w:date="2025-12-10T08:21:00Z" w:initials="AABM">
     <w:p>
       <w:pPr>
         <w:pStyle w:val="CommentText"/>
@@ -14122,7 +14250,7 @@
       </w:r>
     </w:p>
   </w:comment>
-  <w:comment w:id="122" w:author="Dr Nicola J Bowman" w:date="2025-12-08T12:45:00Z" w:initials="NB">
+  <w:comment w:id="123" w:author="Dr Nicola J Bowman" w:date="2025-12-08T12:45:00Z" w:initials="NB">
     <w:p>
       <w:pPr>
         <w:pStyle w:val="CommentText"/>
@@ -14138,7 +14266,7 @@
       </w:r>
     </w:p>
   </w:comment>
-  <w:comment w:id="123" w:author="Dr Nicola J Bowman" w:date="2025-12-08T12:46:00Z" w:initials="NB">
+  <w:comment w:id="124" w:author="Dr Nicola J Bowman" w:date="2025-12-08T12:46:00Z" w:initials="NB">
     <w:p>
       <w:pPr>
         <w:pStyle w:val="CommentText"/>
@@ -14154,7 +14282,7 @@
       </w:r>
     </w:p>
   </w:comment>
-  <w:comment w:id="124" w:author="Alfred Anate Bodurin Mayaki" w:date="2025-12-10T09:06:00Z" w:initials="AABM">
+  <w:comment w:id="125" w:author="Alfred Anate Bodurin Mayaki" w:date="2025-12-10T09:06:00Z" w:initials="AABM">
     <w:p>
       <w:pPr>
         <w:pStyle w:val="CommentText"/>
@@ -14170,7 +14298,7 @@
       </w:r>
     </w:p>
   </w:comment>
-  <w:comment w:id="125" w:author="Alfred Anate Bodurin Mayaki" w:date="2025-12-10T09:09:00Z" w:initials="AABM">
+  <w:comment w:id="126" w:author="Alfred Anate Bodurin Mayaki" w:date="2025-12-10T09:09:00Z" w:initials="AABM">
     <w:p>
       <w:pPr>
         <w:pStyle w:val="CommentText"/>
@@ -14186,7 +14314,7 @@
       </w:r>
     </w:p>
   </w:comment>
-  <w:comment w:id="128" w:author="Dr Nicola J Bowman" w:date="2025-12-08T12:46:00Z" w:initials="NB">
+  <w:comment w:id="129" w:author="Dr Nicola J Bowman" w:date="2025-12-08T12:46:00Z" w:initials="NB">
     <w:p>
       <w:pPr>
         <w:pStyle w:val="CommentText"/>
@@ -14202,7 +14330,7 @@
       </w:r>
     </w:p>
   </w:comment>
-  <w:comment w:id="129" w:author="Alfred Anate Bodurin Mayaki" w:date="2025-12-10T09:10:00Z" w:initials="AABM">
+  <w:comment w:id="130" w:author="Alfred Anate Bodurin Mayaki" w:date="2025-12-10T09:10:00Z" w:initials="AABM">
     <w:p>
       <w:pPr>
         <w:pStyle w:val="CommentText"/>

</xml_diff>

<commit_message>
Concise change to the text
</commit_message>
<xml_diff>
--- a/B894-25K/FBL-PhD-research-proposal.docx
+++ b/B894-25K/FBL-PhD-research-proposal.docx
@@ -5,43 +5,6 @@
     <w:p>
       <w:pPr>
         <w:contextualSpacing/>
-        <w:jc w:val="both"/>
-        <w:rPr>
-          <w:rFonts w:ascii="Arial" w:hAnsi="Arial" w:cs="Arial"/>
-        </w:rPr>
-      </w:pPr>
-    </w:p>
-    <w:p>
-      <w:pPr>
-        <w:contextualSpacing/>
-        <w:jc w:val="both"/>
-        <w:rPr>
-          <w:rFonts w:ascii="Arial" w:hAnsi="Arial" w:cs="Arial"/>
-        </w:rPr>
-      </w:pPr>
-    </w:p>
-    <w:p>
-      <w:pPr>
-        <w:contextualSpacing/>
-        <w:jc w:val="center"/>
-        <w:rPr>
-          <w:rFonts w:ascii="Arial" w:hAnsi="Arial" w:cs="Arial"/>
-        </w:rPr>
-      </w:pPr>
-    </w:p>
-    <w:p>
-      <w:pPr>
-        <w:contextualSpacing/>
-        <w:jc w:val="center"/>
-        <w:rPr>
-          <w:rFonts w:ascii="Arial" w:hAnsi="Arial" w:cs="Arial"/>
-        </w:rPr>
-      </w:pPr>
-    </w:p>
-    <w:p>
-      <w:pPr>
-        <w:contextualSpacing/>
-        <w:jc w:val="center"/>
         <w:rPr>
           <w:rFonts w:ascii="Arial" w:hAnsi="Arial" w:cs="Arial"/>
         </w:rPr>
@@ -429,18 +392,25 @@
     <w:p>
       <w:pPr>
         <w:contextualSpacing/>
-        <w:jc w:val="both"/>
-        <w:rPr>
-          <w:rFonts w:ascii="Arial" w:hAnsi="Arial" w:cs="Arial"/>
-        </w:rPr>
-      </w:pPr>
+        <w:jc w:val="center"/>
+        <w:rPr>
+          <w:rFonts w:ascii="Arial" w:hAnsi="Arial" w:cs="Arial"/>
+        </w:rPr>
+      </w:pPr>
+      <w:r>
+        <w:rPr>
+          <w:rFonts w:ascii="Arial" w:hAnsi="Arial" w:cs="Arial"/>
+        </w:rPr>
+        <w:t>Abstract</w:t>
+      </w:r>
     </w:p>
     <w:p>
       <w:pPr>
         <w:contextualSpacing/>
-        <w:jc w:val="both"/>
-        <w:rPr>
-          <w:rFonts w:ascii="Arial" w:hAnsi="Arial" w:cs="Arial"/>
+        <w:rPr>
+          <w:rFonts w:ascii="Arial" w:hAnsi="Arial" w:cs="Arial"/>
+          <w:sz w:val="20"/>
+          <w:szCs w:val="20"/>
         </w:rPr>
       </w:pPr>
     </w:p>
@@ -450,44 +420,98 @@
         <w:jc w:val="both"/>
         <w:rPr>
           <w:rFonts w:ascii="Arial" w:hAnsi="Arial" w:cs="Arial"/>
-        </w:rPr>
-      </w:pPr>
-    </w:p>
-    <w:p>
-      <w:pPr>
-        <w:contextualSpacing/>
-        <w:jc w:val="both"/>
-        <w:rPr>
-          <w:rFonts w:ascii="Arial" w:hAnsi="Arial" w:cs="Arial"/>
-        </w:rPr>
-      </w:pPr>
-    </w:p>
-    <w:p>
-      <w:pPr>
-        <w:contextualSpacing/>
-        <w:jc w:val="both"/>
-        <w:rPr>
-          <w:rFonts w:ascii="Arial" w:hAnsi="Arial" w:cs="Arial"/>
-        </w:rPr>
-      </w:pPr>
-    </w:p>
-    <w:p>
-      <w:pPr>
-        <w:contextualSpacing/>
-        <w:jc w:val="both"/>
-        <w:rPr>
-          <w:rFonts w:ascii="Arial" w:hAnsi="Arial" w:cs="Arial"/>
-        </w:rPr>
-      </w:pPr>
-    </w:p>
-    <w:p>
-      <w:pPr>
-        <w:contextualSpacing/>
-        <w:jc w:val="both"/>
-        <w:rPr>
-          <w:rFonts w:ascii="Arial" w:hAnsi="Arial" w:cs="Arial"/>
-        </w:rPr>
-      </w:pPr>
+          <w:sz w:val="20"/>
+          <w:szCs w:val="20"/>
+        </w:rPr>
+      </w:pPr>
+      <w:r>
+        <w:rPr>
+          <w:rFonts w:ascii="Arial" w:hAnsi="Arial" w:cs="Arial"/>
+          <w:sz w:val="20"/>
+          <w:szCs w:val="20"/>
+        </w:rPr>
+        <w:t>As A</w:t>
+      </w:r>
+      <w:r>
+        <w:rPr>
+          <w:rFonts w:ascii="Arial" w:hAnsi="Arial" w:cs="Arial"/>
+          <w:sz w:val="20"/>
+          <w:szCs w:val="20"/>
+        </w:rPr>
+        <w:t>rtificial Intelligence (or ‘A</w:t>
+      </w:r>
+      <w:r>
+        <w:rPr>
+          <w:rFonts w:ascii="Arial" w:hAnsi="Arial" w:cs="Arial"/>
+          <w:sz w:val="20"/>
+          <w:szCs w:val="20"/>
+        </w:rPr>
+        <w:t>I</w:t>
+      </w:r>
+      <w:r>
+        <w:rPr>
+          <w:rFonts w:ascii="Arial" w:hAnsi="Arial" w:cs="Arial"/>
+          <w:sz w:val="20"/>
+          <w:szCs w:val="20"/>
+        </w:rPr>
+        <w:t>’) gradually</w:t>
+      </w:r>
+      <w:r>
+        <w:rPr>
+          <w:rFonts w:ascii="Arial" w:hAnsi="Arial" w:cs="Arial"/>
+          <w:sz w:val="20"/>
+          <w:szCs w:val="20"/>
+        </w:rPr>
+        <w:t xml:space="preserve"> enters the vernacular of the human resource profession, researchers and practitioners alike will be mindful of the responsibilities pertaining to AI’s deployment, development and widespread adoption. This research project focuses on the occurrence of AI in the workplace, investigating instances where human resource managers have </w:t>
+      </w:r>
+      <w:r>
+        <w:rPr>
+          <w:rFonts w:ascii="Arial" w:hAnsi="Arial" w:cs="Arial"/>
+          <w:sz w:val="20"/>
+          <w:szCs w:val="20"/>
+        </w:rPr>
+        <w:t xml:space="preserve">facilitated and </w:t>
+      </w:r>
+      <w:r>
+        <w:rPr>
+          <w:rFonts w:ascii="Arial" w:hAnsi="Arial" w:cs="Arial"/>
+          <w:sz w:val="20"/>
+          <w:szCs w:val="20"/>
+        </w:rPr>
+        <w:t>accommodated</w:t>
+      </w:r>
+      <w:r>
+        <w:rPr>
+          <w:rFonts w:ascii="Arial" w:hAnsi="Arial" w:cs="Arial"/>
+          <w:sz w:val="20"/>
+          <w:szCs w:val="20"/>
+        </w:rPr>
+        <w:t>,</w:t>
+      </w:r>
+      <w:r>
+        <w:rPr>
+          <w:rFonts w:ascii="Arial" w:hAnsi="Arial" w:cs="Arial"/>
+          <w:sz w:val="20"/>
+          <w:szCs w:val="20"/>
+        </w:rPr>
+        <w:t xml:space="preserve"> </w:t>
+      </w:r>
+      <w:r>
+        <w:rPr>
+          <w:rFonts w:ascii="Arial" w:hAnsi="Arial" w:cs="Arial"/>
+          <w:sz w:val="20"/>
+          <w:szCs w:val="20"/>
+        </w:rPr>
+        <w:t>necessarily, the effectual implementation of LLMs for the purpose of job search or recruitment. I focus predominantly on the case of Claude Opus 4.5</w:t>
+      </w:r>
+      <w:r>
+        <w:rPr>
+          <w:rFonts w:ascii="Arial" w:hAnsi="Arial" w:cs="Arial"/>
+          <w:sz w:val="20"/>
+          <w:szCs w:val="20"/>
+        </w:rPr>
+        <w:t>.</w:t>
+      </w:r>
     </w:p>
     <w:p>
       <w:pPr>
@@ -906,7 +930,7 @@
                 <w:noProof/>
                 <w:webHidden/>
               </w:rPr>
-              <w:t>4</w:t>
+              <w:t>3</w:t>
             </w:r>
             <w:r>
               <w:rPr>
@@ -1296,7 +1320,7 @@
                 <w:noProof/>
                 <w:webHidden/>
               </w:rPr>
-              <w:t>6</w:t>
+              <w:t>5</w:t>
             </w:r>
             <w:r>
               <w:rPr>
@@ -1686,7 +1710,7 @@
                 <w:noProof/>
                 <w:webHidden/>
               </w:rPr>
-              <w:t>9</w:t>
+              <w:t>8</w:t>
             </w:r>
             <w:r>
               <w:rPr>
@@ -1881,6 +1905,15 @@
     </w:p>
     <w:p>
       <w:pPr>
+        <w:contextualSpacing/>
+        <w:jc w:val="both"/>
+        <w:rPr>
+          <w:rFonts w:ascii="Arial" w:hAnsi="Arial" w:cs="Arial"/>
+        </w:rPr>
+      </w:pPr>
+    </w:p>
+    <w:p>
+      <w:pPr>
         <w:pStyle w:val="Heading2"/>
         <w:contextualSpacing/>
         <w:jc w:val="both"/>
@@ -5422,7 +5455,25 @@
           <w:sz w:val="20"/>
           <w:szCs w:val="20"/>
         </w:rPr>
-        <w:t xml:space="preserve"> (Depp and Jeste, 2004)</w:t>
+        <w:t xml:space="preserve"> (Depp and </w:t>
+      </w:r>
+      <w:proofErr w:type="spellStart"/>
+      <w:r>
+        <w:rPr>
+          <w:rFonts w:ascii="Arial" w:hAnsi="Arial" w:cs="Arial"/>
+          <w:sz w:val="20"/>
+          <w:szCs w:val="20"/>
+        </w:rPr>
+        <w:t>Jeste</w:t>
+      </w:r>
+      <w:proofErr w:type="spellEnd"/>
+      <w:r>
+        <w:rPr>
+          <w:rFonts w:ascii="Arial" w:hAnsi="Arial" w:cs="Arial"/>
+          <w:sz w:val="20"/>
+          <w:szCs w:val="20"/>
+        </w:rPr>
+        <w:t>, 2004)</w:t>
       </w:r>
       <w:r>
         <w:rPr>
@@ -5526,7 +5577,25 @@
           <w:sz w:val="20"/>
           <w:szCs w:val="20"/>
         </w:rPr>
-        <w:t xml:space="preserve">Mirowska and Arsenyan, 2025; </w:t>
+        <w:t xml:space="preserve">Mirowska and </w:t>
+      </w:r>
+      <w:proofErr w:type="spellStart"/>
+      <w:r>
+        <w:rPr>
+          <w:rFonts w:ascii="Arial" w:hAnsi="Arial" w:cs="Arial"/>
+          <w:sz w:val="20"/>
+          <w:szCs w:val="20"/>
+        </w:rPr>
+        <w:t>Arsenyan</w:t>
+      </w:r>
+      <w:proofErr w:type="spellEnd"/>
+      <w:r>
+        <w:rPr>
+          <w:rFonts w:ascii="Arial" w:hAnsi="Arial" w:cs="Arial"/>
+          <w:sz w:val="20"/>
+          <w:szCs w:val="20"/>
+        </w:rPr>
+        <w:t xml:space="preserve">, 2025; </w:t>
       </w:r>
       <w:r>
         <w:rPr>
@@ -5804,6 +5873,7 @@
         </w:rPr>
         <w:t xml:space="preserve">an open access paper by </w:t>
       </w:r>
+      <w:proofErr w:type="spellStart"/>
       <w:r>
         <w:rPr>
           <w:rFonts w:ascii="Arial" w:hAnsi="Arial" w:cs="Arial"/>
@@ -5812,6 +5882,7 @@
         </w:rPr>
         <w:t>Chilunjika</w:t>
       </w:r>
+      <w:proofErr w:type="spellEnd"/>
       <w:r>
         <w:rPr>
           <w:rFonts w:ascii="Arial" w:hAnsi="Arial" w:cs="Arial"/>
@@ -5860,7 +5931,25 @@
           <w:sz w:val="20"/>
           <w:szCs w:val="20"/>
         </w:rPr>
-        <w:t xml:space="preserve"> Chilunjika, </w:t>
+        <w:t xml:space="preserve"> </w:t>
+      </w:r>
+      <w:proofErr w:type="spellStart"/>
+      <w:r>
+        <w:rPr>
+          <w:rFonts w:ascii="Arial" w:hAnsi="Arial" w:cs="Arial"/>
+          <w:sz w:val="20"/>
+          <w:szCs w:val="20"/>
+        </w:rPr>
+        <w:t>Chilunjika</w:t>
+      </w:r>
+      <w:proofErr w:type="spellEnd"/>
+      <w:r>
+        <w:rPr>
+          <w:rFonts w:ascii="Arial" w:hAnsi="Arial" w:cs="Arial"/>
+          <w:sz w:val="20"/>
+          <w:szCs w:val="20"/>
+        </w:rPr>
+        <w:t xml:space="preserve">, </w:t>
       </w:r>
       <w:r>
         <w:rPr>
@@ -6748,7 +6837,27 @@
                 <w:sz w:val="20"/>
                 <w:szCs w:val="20"/>
               </w:rPr>
-              <w:t>Dutta &amp; Adsule (2025)</w:t>
+              <w:t xml:space="preserve">Dutta &amp; </w:t>
+            </w:r>
+            <w:proofErr w:type="spellStart"/>
+            <w:r>
+              <w:rPr>
+                <w:rFonts w:ascii="Arial" w:hAnsi="Arial" w:cs="Arial"/>
+                <w:color w:val="000000" w:themeColor="text1"/>
+                <w:sz w:val="20"/>
+                <w:szCs w:val="20"/>
+              </w:rPr>
+              <w:t>Adsule</w:t>
+            </w:r>
+            <w:proofErr w:type="spellEnd"/>
+            <w:r>
+              <w:rPr>
+                <w:rFonts w:ascii="Arial" w:hAnsi="Arial" w:cs="Arial"/>
+                <w:color w:val="000000" w:themeColor="text1"/>
+                <w:sz w:val="20"/>
+                <w:szCs w:val="20"/>
+              </w:rPr>
+              <w:t xml:space="preserve"> (2025)</w:t>
             </w:r>
           </w:p>
         </w:tc>
@@ -6824,14 +6933,25 @@
                 <w:szCs w:val="20"/>
               </w:rPr>
             </w:pPr>
-            <w:r>
-              <w:rPr>
-                <w:rFonts w:ascii="Arial" w:hAnsi="Arial" w:cs="Arial"/>
-                <w:color w:val="000000" w:themeColor="text1"/>
-                <w:sz w:val="20"/>
-                <w:szCs w:val="20"/>
-              </w:rPr>
-              <w:t>Lup and Canonico (2024)</w:t>
+            <w:proofErr w:type="spellStart"/>
+            <w:r>
+              <w:rPr>
+                <w:rFonts w:ascii="Arial" w:hAnsi="Arial" w:cs="Arial"/>
+                <w:color w:val="000000" w:themeColor="text1"/>
+                <w:sz w:val="20"/>
+                <w:szCs w:val="20"/>
+              </w:rPr>
+              <w:t>Lup</w:t>
+            </w:r>
+            <w:proofErr w:type="spellEnd"/>
+            <w:r>
+              <w:rPr>
+                <w:rFonts w:ascii="Arial" w:hAnsi="Arial" w:cs="Arial"/>
+                <w:color w:val="000000" w:themeColor="text1"/>
+                <w:sz w:val="20"/>
+                <w:szCs w:val="20"/>
+              </w:rPr>
+              <w:t xml:space="preserve"> and Canonico (2024)</w:t>
             </w:r>
           </w:p>
         </w:tc>
@@ -10886,13 +11006,59 @@
           <w:szCs w:val="20"/>
         </w:rPr>
       </w:pPr>
-      <w:r>
-        <w:rPr>
-          <w:rFonts w:ascii="Arial" w:hAnsi="Arial" w:cs="Arial"/>
-          <w:sz w:val="20"/>
-          <w:szCs w:val="20"/>
-        </w:rPr>
-        <w:t xml:space="preserve">Chilunjika, A., Intauno, K. &amp; Chilunjika, S.R. (2022) “Artificial intelligence and public sector human resource management in South Africa: Opportunities, challenges and prospects,” </w:t>
+      <w:proofErr w:type="spellStart"/>
+      <w:r>
+        <w:rPr>
+          <w:rFonts w:ascii="Arial" w:hAnsi="Arial" w:cs="Arial"/>
+          <w:sz w:val="20"/>
+          <w:szCs w:val="20"/>
+        </w:rPr>
+        <w:t>Chilunjika</w:t>
+      </w:r>
+      <w:proofErr w:type="spellEnd"/>
+      <w:r>
+        <w:rPr>
+          <w:rFonts w:ascii="Arial" w:hAnsi="Arial" w:cs="Arial"/>
+          <w:sz w:val="20"/>
+          <w:szCs w:val="20"/>
+        </w:rPr>
+        <w:t xml:space="preserve">, A., </w:t>
+      </w:r>
+      <w:proofErr w:type="spellStart"/>
+      <w:r>
+        <w:rPr>
+          <w:rFonts w:ascii="Arial" w:hAnsi="Arial" w:cs="Arial"/>
+          <w:sz w:val="20"/>
+          <w:szCs w:val="20"/>
+        </w:rPr>
+        <w:t>Intauno</w:t>
+      </w:r>
+      <w:proofErr w:type="spellEnd"/>
+      <w:r>
+        <w:rPr>
+          <w:rFonts w:ascii="Arial" w:hAnsi="Arial" w:cs="Arial"/>
+          <w:sz w:val="20"/>
+          <w:szCs w:val="20"/>
+        </w:rPr>
+        <w:t xml:space="preserve">, K. &amp; </w:t>
+      </w:r>
+      <w:proofErr w:type="spellStart"/>
+      <w:r>
+        <w:rPr>
+          <w:rFonts w:ascii="Arial" w:hAnsi="Arial" w:cs="Arial"/>
+          <w:sz w:val="20"/>
+          <w:szCs w:val="20"/>
+        </w:rPr>
+        <w:t>Chilunjika</w:t>
+      </w:r>
+      <w:proofErr w:type="spellEnd"/>
+      <w:r>
+        <w:rPr>
+          <w:rFonts w:ascii="Arial" w:hAnsi="Arial" w:cs="Arial"/>
+          <w:sz w:val="20"/>
+          <w:szCs w:val="20"/>
+        </w:rPr>
+        <w:t xml:space="preserve">, S.R. (2022) “Artificial intelligence and public sector human resource management in South Africa: Opportunities, challenges and prospects,” </w:t>
       </w:r>
       <w:r>
         <w:rPr>
@@ -11109,7 +11275,43 @@
           <w:sz w:val="20"/>
           <w:szCs w:val="20"/>
         </w:rPr>
-        <w:t xml:space="preserve">Depp, C.A. and Jeste, D.V. (2004), Bipolar disorder in older adults: a critical review. Bipolar Disorders, 6: 343-367. </w:t>
+        <w:t xml:space="preserve">Depp, C.A. and </w:t>
+      </w:r>
+      <w:proofErr w:type="spellStart"/>
+      <w:r>
+        <w:rPr>
+          <w:rFonts w:ascii="Arial" w:hAnsi="Arial" w:cs="Arial"/>
+          <w:sz w:val="20"/>
+          <w:szCs w:val="20"/>
+        </w:rPr>
+        <w:t>Jeste</w:t>
+      </w:r>
+      <w:proofErr w:type="spellEnd"/>
+      <w:r>
+        <w:rPr>
+          <w:rFonts w:ascii="Arial" w:hAnsi="Arial" w:cs="Arial"/>
+          <w:sz w:val="20"/>
+          <w:szCs w:val="20"/>
+        </w:rPr>
+        <w:t xml:space="preserve">, D.V. (2004), </w:t>
+      </w:r>
+      <w:proofErr w:type="gramStart"/>
+      <w:r>
+        <w:rPr>
+          <w:rFonts w:ascii="Arial" w:hAnsi="Arial" w:cs="Arial"/>
+          <w:sz w:val="20"/>
+          <w:szCs w:val="20"/>
+        </w:rPr>
+        <w:t>Bipolar disorder</w:t>
+      </w:r>
+      <w:proofErr w:type="gramEnd"/>
+      <w:r>
+        <w:rPr>
+          <w:rFonts w:ascii="Arial" w:hAnsi="Arial" w:cs="Arial"/>
+          <w:sz w:val="20"/>
+          <w:szCs w:val="20"/>
+        </w:rPr>
+        <w:t xml:space="preserve"> in older adults: a critical review. Bipolar Disorders, 6: 343-367. </w:t>
       </w:r>
       <w:hyperlink r:id="rId16" w:history="1">
         <w:r>
@@ -11191,7 +11393,25 @@
           <w:sz w:val="20"/>
           <w:szCs w:val="20"/>
         </w:rPr>
-        <w:t>Dutta D, Adsule R (2025;) "Machines/humans agentic impacts on recruitment and selection practices across organizational contexts". </w:t>
+        <w:t>Dutta D, </w:t>
+      </w:r>
+      <w:proofErr w:type="spellStart"/>
+      <w:r>
+        <w:rPr>
+          <w:rFonts w:ascii="Arial" w:hAnsi="Arial" w:cs="Arial"/>
+          <w:sz w:val="20"/>
+          <w:szCs w:val="20"/>
+        </w:rPr>
+        <w:t>Adsule</w:t>
+      </w:r>
+      <w:proofErr w:type="spellEnd"/>
+      <w:r>
+        <w:rPr>
+          <w:rFonts w:ascii="Arial" w:hAnsi="Arial" w:cs="Arial"/>
+          <w:sz w:val="20"/>
+          <w:szCs w:val="20"/>
+        </w:rPr>
+        <w:t xml:space="preserve"> R (2025;) "Machines/humans agentic impacts on recruitment and selection practices across organizational contexts". </w:t>
       </w:r>
       <w:r>
         <w:rPr>
@@ -11424,7 +11644,25 @@
           <w:sz w:val="20"/>
           <w:szCs w:val="20"/>
         </w:rPr>
-        <w:t>Jones, D.A., Willness, C.R. and Madey, S. (2014) ‘Why Are Job Seekers Attracted by Corporate Social Performance? Experimental and Field Tests of Three Signal-Based Mechanisms’, </w:t>
+        <w:t xml:space="preserve">Jones, D.A., </w:t>
+      </w:r>
+      <w:proofErr w:type="spellStart"/>
+      <w:r>
+        <w:rPr>
+          <w:rFonts w:ascii="Arial" w:hAnsi="Arial" w:cs="Arial"/>
+          <w:sz w:val="20"/>
+          <w:szCs w:val="20"/>
+        </w:rPr>
+        <w:t>Willness</w:t>
+      </w:r>
+      <w:proofErr w:type="spellEnd"/>
+      <w:r>
+        <w:rPr>
+          <w:rFonts w:ascii="Arial" w:hAnsi="Arial" w:cs="Arial"/>
+          <w:sz w:val="20"/>
+          <w:szCs w:val="20"/>
+        </w:rPr>
+        <w:t>, C.R. and Madey, S. (2014) ‘Why Are Job Seekers Attracted by Corporate Social Performance? Experimental and Field Tests of Three Signal-Based Mechanisms’, </w:t>
       </w:r>
       <w:r>
         <w:rPr>
@@ -11484,7 +11722,25 @@
           <w:sz w:val="20"/>
           <w:szCs w:val="20"/>
         </w:rPr>
-        <w:t xml:space="preserve">Khan, M. H., Grabarski, M. K., Ali, M., &amp; Buckmaster, S. (2023). Insights into Creating and Managing an Inclusive Neurodiverse Workplace for Positive Outcomes: A Multistage Theoretical </w:t>
+        <w:t xml:space="preserve">Khan, M. H., </w:t>
+      </w:r>
+      <w:proofErr w:type="spellStart"/>
+      <w:r>
+        <w:rPr>
+          <w:rFonts w:ascii="Arial" w:hAnsi="Arial" w:cs="Arial"/>
+          <w:sz w:val="20"/>
+          <w:szCs w:val="20"/>
+        </w:rPr>
+        <w:t>Grabarski</w:t>
+      </w:r>
+      <w:proofErr w:type="spellEnd"/>
+      <w:r>
+        <w:rPr>
+          <w:rFonts w:ascii="Arial" w:hAnsi="Arial" w:cs="Arial"/>
+          <w:sz w:val="20"/>
+          <w:szCs w:val="20"/>
+        </w:rPr>
+        <w:t xml:space="preserve">, M. K., Ali, M., &amp; Buckmaster, S. (2023). Insights into Creating and Managing an Inclusive Neurodiverse Workplace for Positive Outcomes: A Multistage Theoretical </w:t>
       </w:r>
       <w:r>
         <w:rPr>
@@ -11626,13 +11882,23 @@
           <w:szCs w:val="20"/>
         </w:rPr>
       </w:pPr>
-      <w:r>
-        <w:rPr>
-          <w:rFonts w:ascii="Arial" w:hAnsi="Arial" w:cs="Arial"/>
-          <w:sz w:val="20"/>
-          <w:szCs w:val="20"/>
-        </w:rPr>
-        <w:t>Lup, D. and Canonico, E. (2024) ‘Bridges and gatekeepers: Employees' willingness to refer qualified candidates on the autism spectrum’, </w:t>
+      <w:proofErr w:type="spellStart"/>
+      <w:r>
+        <w:rPr>
+          <w:rFonts w:ascii="Arial" w:hAnsi="Arial" w:cs="Arial"/>
+          <w:sz w:val="20"/>
+          <w:szCs w:val="20"/>
+        </w:rPr>
+        <w:t>Lup</w:t>
+      </w:r>
+      <w:proofErr w:type="spellEnd"/>
+      <w:r>
+        <w:rPr>
+          <w:rFonts w:ascii="Arial" w:hAnsi="Arial" w:cs="Arial"/>
+          <w:sz w:val="20"/>
+          <w:szCs w:val="20"/>
+        </w:rPr>
+        <w:t>, D. and Canonico, E. (2024) ‘Bridges and gatekeepers: Employees' willingness to refer qualified candidates on the autism spectrum’, </w:t>
       </w:r>
       <w:r>
         <w:rPr>
@@ -11730,7 +11996,25 @@
           <w:sz w:val="20"/>
           <w:szCs w:val="20"/>
         </w:rPr>
-        <w:t>Mirowska, A. and Arsenyan, J. (2025), A Bridge Too Far: Signalling Effects of Artificial Intelligence Evaluation of Job Interviews. International Journal of Selection and Assessment, 33: e70008. </w:t>
+        <w:t xml:space="preserve">Mirowska, A. and </w:t>
+      </w:r>
+      <w:proofErr w:type="spellStart"/>
+      <w:r>
+        <w:rPr>
+          <w:rFonts w:ascii="Arial" w:hAnsi="Arial" w:cs="Arial"/>
+          <w:sz w:val="20"/>
+          <w:szCs w:val="20"/>
+        </w:rPr>
+        <w:t>Arsenyan</w:t>
+      </w:r>
+      <w:proofErr w:type="spellEnd"/>
+      <w:r>
+        <w:rPr>
+          <w:rFonts w:ascii="Arial" w:hAnsi="Arial" w:cs="Arial"/>
+          <w:sz w:val="20"/>
+          <w:szCs w:val="20"/>
+        </w:rPr>
+        <w:t>, J. (2025), A Bridge Too Far: Signalling Effects of Artificial Intelligence Evaluation of Job Interviews. International Journal of Selection and Assessment, 33: e70008. </w:t>
       </w:r>
       <w:hyperlink r:id="rId23" w:history="1">
         <w:r>

</xml_diff>